<commit_message>
Add the submitted Statisfied TA2: five-title paper and its PDF
The submitted copy drops Title 6 (TransCo) and ranks the rest 1 BAPTC,
2 QC, 3 milk retail, 4 SM Foundation, 5 child immunization. The Final
Recommendation justifies each rank from the title's RRL and RRS. Empty
source slots are removed, Title 5 gains verified Philippine sources, and
the PDF carries the activity's required name. The six-title paper is
updated with the same fixes and kept as the fallback copy.

Co-Authored-By: Claude Opus 5.5 <noreply@anthropic.com>
</commit_message>
<xml_diff>
--- a/Software Engineering 1/PAMESA - TA2 RRL and RRS.docx
+++ b/Software Engineering 1/PAMESA - TA2 RRL and RRS.docx
@@ -6228,7 +6228,7 @@
           <w:i/>
           <w:sz w:val="18"/>
         </w:rPr>
-        <w:t xml:space="preserve">Scores use the activity's 1 to 5 scale, where 5 is highly feasible. The group's ranking across all six titles is carried in the final comparison table.</w:t>
+        <w:t>Scores use the activity's 1 to 5 scale, where 5 is highly feasible. The group's ranking across all six titles is carried in the final comparison table.</w:t>
       </w:r>
     </w:p>
     <w:tbl>
@@ -7832,38 +7832,6 @@
     </w:p>
     <w:p>
       <w:pPr>
-        <w:spacing w:before="120" w:after="40"/>
-        <w:ind w:left="432" w:hanging="432"/>
-      </w:pPr>
-      <w:r>
-        <w:t>4.</w:t>
-        <w:tab/>
-      </w:r>
-      <w:r>
-        <w:rPr>
-          <w:highlight w:val="yellow"/>
-        </w:rPr>
-        <w:t>[Open slot: add one local study here.]</w:t>
-      </w:r>
-    </w:p>
-    <w:p>
-      <w:pPr>
-        <w:spacing w:before="120" w:after="40"/>
-        <w:ind w:left="432" w:hanging="432"/>
-      </w:pPr>
-      <w:r>
-        <w:t>5.</w:t>
-        <w:tab/>
-      </w:r>
-      <w:r>
-        <w:rPr>
-          <w:highlight w:val="yellow"/>
-        </w:rPr>
-        <w:t>[Open slot: add one local study here.]</w:t>
-      </w:r>
-    </w:p>
-    <w:p>
-      <w:pPr>
         <w:keepNext/>
         <w:spacing w:before="80" w:after="80"/>
       </w:pPr>
@@ -7882,7 +7850,7 @@
         <w:ind w:left="432" w:hanging="432"/>
       </w:pPr>
       <w:r>
-        <w:t>6.</w:t>
+        <w:t>4.</w:t>
         <w:tab/>
       </w:r>
       <w:r>
@@ -7941,7 +7909,7 @@
         <w:ind w:left="432" w:hanging="432"/>
       </w:pPr>
       <w:r>
-        <w:t>7.</w:t>
+        <w:t>5.</w:t>
         <w:tab/>
       </w:r>
       <w:r>
@@ -7990,7 +7958,7 @@
         <w:ind w:left="432" w:hanging="432"/>
       </w:pPr>
       <w:r>
-        <w:t>8.</w:t>
+        <w:t>6.</w:t>
         <w:tab/>
       </w:r>
       <w:r>
@@ -8049,7 +8017,7 @@
         <w:ind w:left="432" w:hanging="432"/>
       </w:pPr>
       <w:r>
-        <w:t>9.</w:t>
+        <w:t>7.</w:t>
         <w:tab/>
       </w:r>
       <w:r>
@@ -8108,7 +8076,7 @@
         <w:ind w:left="432" w:hanging="432"/>
       </w:pPr>
       <w:r>
-        <w:t>10.</w:t>
+        <w:t>8.</w:t>
         <w:tab/>
       </w:r>
       <w:r>
@@ -13663,70 +13631,6 @@
     </w:p>
     <w:p>
       <w:pPr>
-        <w:spacing w:before="120" w:after="40"/>
-        <w:ind w:left="432" w:hanging="432"/>
-      </w:pPr>
-      <w:r>
-        <w:t>2.</w:t>
-        <w:tab/>
-      </w:r>
-      <w:r>
-        <w:rPr>
-          <w:highlight w:val="yellow"/>
-        </w:rPr>
-        <w:t>[Open slot: add one local literature here.]</w:t>
-      </w:r>
-    </w:p>
-    <w:p>
-      <w:pPr>
-        <w:spacing w:before="120" w:after="40"/>
-        <w:ind w:left="432" w:hanging="432"/>
-      </w:pPr>
-      <w:r>
-        <w:t>3.</w:t>
-        <w:tab/>
-      </w:r>
-      <w:r>
-        <w:rPr>
-          <w:highlight w:val="yellow"/>
-        </w:rPr>
-        <w:t>[Open slot: add one local literature here.]</w:t>
-      </w:r>
-    </w:p>
-    <w:p>
-      <w:pPr>
-        <w:spacing w:before="120" w:after="40"/>
-        <w:ind w:left="432" w:hanging="432"/>
-      </w:pPr>
-      <w:r>
-        <w:t>4.</w:t>
-        <w:tab/>
-      </w:r>
-      <w:r>
-        <w:rPr>
-          <w:highlight w:val="yellow"/>
-        </w:rPr>
-        <w:t>[Open slot: add one local literature here.]</w:t>
-      </w:r>
-    </w:p>
-    <w:p>
-      <w:pPr>
-        <w:spacing w:before="120" w:after="40"/>
-        <w:ind w:left="432" w:hanging="432"/>
-      </w:pPr>
-      <w:r>
-        <w:t>5.</w:t>
-        <w:tab/>
-      </w:r>
-      <w:r>
-        <w:rPr>
-          <w:highlight w:val="yellow"/>
-        </w:rPr>
-        <w:t>[Open slot: add one local literature here.]</w:t>
-      </w:r>
-    </w:p>
-    <w:p>
-      <w:pPr>
         <w:keepNext/>
         <w:spacing w:before="80" w:after="80"/>
       </w:pPr>
@@ -13745,7 +13649,7 @@
         <w:ind w:left="432" w:hanging="432"/>
       </w:pPr>
       <w:r>
-        <w:t>6.</w:t>
+        <w:t>2.</w:t>
         <w:tab/>
       </w:r>
       <w:r>
@@ -13804,7 +13708,7 @@
         <w:ind w:left="432" w:hanging="432"/>
       </w:pPr>
       <w:r>
-        <w:t>7.</w:t>
+        <w:t>3.</w:t>
         <w:tab/>
       </w:r>
       <w:r>
@@ -13863,7 +13767,7 @@
         <w:ind w:left="432" w:hanging="432"/>
       </w:pPr>
       <w:r>
-        <w:t>8.</w:t>
+        <w:t>4.</w:t>
         <w:tab/>
       </w:r>
       <w:r>
@@ -13922,7 +13826,7 @@
         <w:ind w:left="432" w:hanging="432"/>
       </w:pPr>
       <w:r>
-        <w:t>9.</w:t>
+        <w:t>5.</w:t>
         <w:tab/>
       </w:r>
       <w:r>
@@ -13972,22 +13876,6 @@
       </w:pPr>
       <w:r>
         <w:t>Source: https://doi.org/10.1177/2053951717745678</w:t>
-      </w:r>
-    </w:p>
-    <w:p>
-      <w:pPr>
-        <w:spacing w:before="120" w:after="40"/>
-        <w:ind w:left="432" w:hanging="432"/>
-      </w:pPr>
-      <w:r>
-        <w:t>10.</w:t>
-        <w:tab/>
-      </w:r>
-      <w:r>
-        <w:rPr>
-          <w:highlight w:val="yellow"/>
-        </w:rPr>
-        <w:t>[Open slot: add one foreign literature here.]</w:t>
       </w:r>
     </w:p>
     <w:p>
@@ -14148,54 +14036,6 @@
     </w:p>
     <w:p>
       <w:pPr>
-        <w:spacing w:before="120" w:after="40"/>
-        <w:ind w:left="432" w:hanging="432"/>
-      </w:pPr>
-      <w:r>
-        <w:t>3.</w:t>
-        <w:tab/>
-      </w:r>
-      <w:r>
-        <w:rPr>
-          <w:highlight w:val="yellow"/>
-        </w:rPr>
-        <w:t>[Open slot: add one local study here.]</w:t>
-      </w:r>
-    </w:p>
-    <w:p>
-      <w:pPr>
-        <w:spacing w:before="120" w:after="40"/>
-        <w:ind w:left="432" w:hanging="432"/>
-      </w:pPr>
-      <w:r>
-        <w:t>4.</w:t>
-        <w:tab/>
-      </w:r>
-      <w:r>
-        <w:rPr>
-          <w:highlight w:val="yellow"/>
-        </w:rPr>
-        <w:t>[Open slot: add one local study here.]</w:t>
-      </w:r>
-    </w:p>
-    <w:p>
-      <w:pPr>
-        <w:spacing w:before="120" w:after="40"/>
-        <w:ind w:left="432" w:hanging="432"/>
-      </w:pPr>
-      <w:r>
-        <w:t>5.</w:t>
-        <w:tab/>
-      </w:r>
-      <w:r>
-        <w:rPr>
-          <w:highlight w:val="yellow"/>
-        </w:rPr>
-        <w:t>[Open slot: add one local study here.]</w:t>
-      </w:r>
-    </w:p>
-    <w:p>
-      <w:pPr>
         <w:keepNext/>
         <w:spacing w:before="80" w:after="80"/>
       </w:pPr>
@@ -14214,7 +14054,7 @@
         <w:ind w:left="432" w:hanging="432"/>
       </w:pPr>
       <w:r>
-        <w:t>6.</w:t>
+        <w:t>3.</w:t>
         <w:tab/>
       </w:r>
       <w:r>
@@ -14273,7 +14113,7 @@
         <w:ind w:left="432" w:hanging="432"/>
       </w:pPr>
       <w:r>
-        <w:t>7.</w:t>
+        <w:t>4.</w:t>
         <w:tab/>
       </w:r>
       <w:r>
@@ -14332,7 +14172,7 @@
         <w:ind w:left="432" w:hanging="432"/>
       </w:pPr>
       <w:r>
-        <w:t>8.</w:t>
+        <w:t>5.</w:t>
         <w:tab/>
       </w:r>
       <w:r>
@@ -14382,38 +14222,6 @@
       </w:pPr>
       <w:r>
         <w:t>Source: https://doi.org/10.1007/s11222-017-9746-6</w:t>
-      </w:r>
-    </w:p>
-    <w:p>
-      <w:pPr>
-        <w:spacing w:before="120" w:after="40"/>
-        <w:ind w:left="432" w:hanging="432"/>
-      </w:pPr>
-      <w:r>
-        <w:t>9.</w:t>
-        <w:tab/>
-      </w:r>
-      <w:r>
-        <w:rPr>
-          <w:highlight w:val="yellow"/>
-        </w:rPr>
-        <w:t>[Open slot: add one foreign study here.]</w:t>
-      </w:r>
-    </w:p>
-    <w:p>
-      <w:pPr>
-        <w:spacing w:before="120" w:after="40"/>
-        <w:ind w:left="432" w:hanging="432"/>
-      </w:pPr>
-      <w:r>
-        <w:t>10.</w:t>
-        <w:tab/>
-      </w:r>
-      <w:r>
-        <w:rPr>
-          <w:highlight w:val="yellow"/>
-        </w:rPr>
-        <w:t>[Open slot: add one foreign study here.]</w:t>
       </w:r>
     </w:p>
     <w:p>
@@ -14524,13 +14332,11 @@
         <w:t xml:space="preserve">Du, </w:t>
       </w:r>
       <w:r>
-        <w:rPr>
-          <w:highlight w:val="yellow"/>
-        </w:rPr>
-        <w:t>[author initials]</w:t>
-      </w:r>
-      <w:r>
-        <w:t>. (2026). Enhancing CRVS data quality and inclusivity through integration with PhilSys. https://getinthepicture.org/system/files/sites/default/files/B1_Session%203.2_102_Du_Paper_0.pdf</w:t>
+        <w:rPr/>
+        <w:t>A. S</w:t>
+      </w:r>
+      <w:r>
+        <w:t>. (2026). Enhancing CRVS data quality and inclusivity through integration with PhilSys. Paper presented at the 2026 CRVS Research Forum, Bangkok, Thailand. https://getinthepicture.org/system/files/sites/default/files/B1_Session%203.2_102_Du_Paper_0.pdf</w:t>
       </w:r>
     </w:p>
     <w:p>
@@ -20274,7 +20080,7 @@
           <w:i/>
           <w:sz w:val="18"/>
         </w:rPr>
-        <w:t xml:space="preserve">Scores use the activity's 1 to 5 scale, where 5 is highly feasible. The group's ranking across all six titles is carried in the final comparison table.</w:t>
+        <w:t>Scores use the activity's 1 to 5 scale, where 5 is highly feasible. The group's ranking across all six titles is carried in the final comparison table.</w:t>
       </w:r>
     </w:p>
     <w:tbl>
@@ -21389,7 +21195,7 @@
         <w:t>Description / Summary (Local Literature).</w:t>
       </w:r>
       <w:r>
-        <w:t xml:space="preserve"> The national open-data portal publishes government datasets from participating agencies. When the group reviewed it on September 19, 2026, it listed 175 datasets from 17 publishing agencies, no local government unit publishers, and most recent retrieval dates from 2022 to 2023.</w:t>
+        <w:t xml:space="preserve"> The national open-data portal publishes government datasets from participating agencies. When the group reviewed it on September 19, 2026, and again on September 24, 2026, it listed 175 datasets from 17 publishing agencies, no local government unit publishers, and most recent retrieval dates from 2022 to 2023.</w:t>
       </w:r>
     </w:p>
     <w:p>
@@ -21416,19 +21222,6 @@
       </w:pPr>
       <w:r>
         <w:t>Source: https://data.gov.ph</w:t>
-      </w:r>
-    </w:p>
-    <w:p>
-      <w:pPr>
-        <w:spacing w:after="40"/>
-        <w:ind w:left="432"/>
-        <w:jc w:val="both"/>
-      </w:pPr>
-      <w:r>
-        <w:rPr>
-          <w:highlight w:val="yellow"/>
-        </w:rPr>
-        <w:t>[The counts are the group's own observation on September 19, 2026. Re-check them before submitting.]</w:t>
       </w:r>
     </w:p>
     <w:p>
@@ -23556,14 +23349,13 @@
               <w:rPr>
                 <w:sz w:val="18"/>
               </w:rPr>
-              <w:t xml:space="preserve">A barangay health center in Mandaluyong City, which owns the records. </w:t>
-            </w:r>
-            <w:r>
-              <w:rPr>
-                <w:sz w:val="18"/>
-                <w:highlight w:val="yellow"/>
-              </w:rPr>
-              <w:t>[Name the health center and the status of the request.]</w:t>
+              <w:t>A barangay health center in Mandaluyong City, which owns the records.</w:t>
+            </w:r>
+            <w:r>
+              <w:rPr>
+                <w:sz w:val="18"/>
+              </w:rPr>
+              <w:t xml:space="preserve"> The specific health center is still being identified, so no request has been sent yet.</w:t>
             </w:r>
           </w:p>
         </w:tc>
@@ -23646,9 +23438,8 @@
             <w:r>
               <w:rPr>
                 <w:sz w:val="18"/>
-                <w:highlight w:val="yellow"/>
-              </w:rPr>
-              <w:t>[Confirm the record count. The study needs at least 10,000 records, and whether simulated records count toward that floor should be confirmed with Ma'am.]</w:t>
+              </w:rPr>
+              <w:t>To be confirmed once a health center agrees to take part. The study needs at least 10,000 records, which is difficult to reach at a single health center, and whether simulated records count toward that floor is still to be confirmed with the professor.</w:t>
             </w:r>
           </w:p>
         </w:tc>
@@ -26185,10 +25976,7 @@
         <w:t xml:space="preserve">Scores use the activity's 1 to 5 scale, where 5 is highly feasible. The group's ranking across all six titles is carried in the final comparison table. </w:t>
       </w:r>
       <w:r>
-        <w:rPr>
-          <w:highlight w:val="yellow"/>
-        </w:rPr>
-        <w:t>[These scores were assigned by Dawn from the write-up; the Title 4 authors should confirm them.]</w:t>
+        <w:rPr/>
       </w:r>
     </w:p>
     <w:tbl>
@@ -26895,22 +26683,6 @@
     </w:p>
     <w:p>
       <w:pPr>
-        <w:spacing w:before="120" w:after="40"/>
-        <w:ind w:left="432" w:hanging="432"/>
-      </w:pPr>
-      <w:r>
-        <w:t>5.</w:t>
-        <w:tab/>
-      </w:r>
-      <w:r>
-        <w:rPr>
-          <w:highlight w:val="yellow"/>
-        </w:rPr>
-        <w:t>[Open slot: add one local literature here.]</w:t>
-      </w:r>
-    </w:p>
-    <w:p>
-      <w:pPr>
         <w:keepNext/>
         <w:spacing w:before="80" w:after="80"/>
       </w:pPr>
@@ -26929,7 +26701,7 @@
         <w:ind w:left="432" w:hanging="432"/>
       </w:pPr>
       <w:r>
-        <w:t>6.</w:t>
+        <w:t>5.</w:t>
         <w:tab/>
       </w:r>
       <w:r>
@@ -26962,7 +26734,7 @@
         <w:ind w:left="432" w:hanging="432"/>
       </w:pPr>
       <w:r>
-        <w:t>7.</w:t>
+        <w:t>6.</w:t>
         <w:tab/>
       </w:r>
       <w:r>
@@ -26995,7 +26767,7 @@
         <w:ind w:left="432" w:hanging="432"/>
       </w:pPr>
       <w:r>
-        <w:t>8.</w:t>
+        <w:t>7.</w:t>
         <w:tab/>
       </w:r>
       <w:r>
@@ -27028,7 +26800,7 @@
         <w:ind w:left="432" w:hanging="432"/>
       </w:pPr>
       <w:r>
-        <w:t>9.</w:t>
+        <w:t>8.</w:t>
         <w:tab/>
       </w:r>
       <w:r>
@@ -27061,7 +26833,7 @@
         <w:ind w:left="432" w:hanging="432"/>
       </w:pPr>
       <w:r>
-        <w:t>10.</w:t>
+        <w:t>9.</w:t>
         <w:tab/>
       </w:r>
       <w:r>
@@ -27378,22 +27150,6 @@
     </w:p>
     <w:p>
       <w:pPr>
-        <w:spacing w:before="120" w:after="40"/>
-        <w:ind w:left="432" w:hanging="432"/>
-      </w:pPr>
-      <w:r>
-        <w:t>5.</w:t>
-        <w:tab/>
-      </w:r>
-      <w:r>
-        <w:rPr>
-          <w:highlight w:val="yellow"/>
-        </w:rPr>
-        <w:t>[Open slot: add one local study here.]</w:t>
-      </w:r>
-    </w:p>
-    <w:p>
-      <w:pPr>
         <w:keepNext/>
         <w:spacing w:before="80" w:after="80"/>
       </w:pPr>
@@ -27412,7 +27168,7 @@
         <w:ind w:left="432" w:hanging="432"/>
       </w:pPr>
       <w:r>
-        <w:t>6.</w:t>
+        <w:t>5.</w:t>
         <w:tab/>
       </w:r>
       <w:r>
@@ -27445,7 +27201,7 @@
         <w:ind w:left="432" w:hanging="432"/>
       </w:pPr>
       <w:r>
-        <w:t>7.</w:t>
+        <w:t>6.</w:t>
         <w:tab/>
       </w:r>
       <w:r>
@@ -27478,7 +27234,7 @@
         <w:ind w:left="432" w:hanging="432"/>
       </w:pPr>
       <w:r>
-        <w:t>8.</w:t>
+        <w:t>7.</w:t>
         <w:tab/>
       </w:r>
       <w:r>
@@ -27511,7 +27267,7 @@
         <w:ind w:left="432" w:hanging="432"/>
       </w:pPr>
       <w:r>
-        <w:t>9.</w:t>
+        <w:t>8.</w:t>
         <w:tab/>
       </w:r>
       <w:r>
@@ -27535,22 +27291,6 @@
       </w:r>
       <w:r>
         <w:t xml:space="preserve"> This recent patient linkage study shows that combining rules with matching models can improve record linkage. The proposed undergraduate system uses the simpler, more explainable rule and fuzzy matching approach.</w:t>
-      </w:r>
-    </w:p>
-    <w:p>
-      <w:pPr>
-        <w:spacing w:before="120" w:after="40"/>
-        <w:ind w:left="432" w:hanging="432"/>
-      </w:pPr>
-      <w:r>
-        <w:t>10.</w:t>
-        <w:tab/>
-      </w:r>
-      <w:r>
-        <w:rPr>
-          <w:highlight w:val="yellow"/>
-        </w:rPr>
-        <w:t>[Open slot: add one foreign study here.]</w:t>
       </w:r>
     </w:p>
     <w:p>
@@ -30495,10 +30235,7 @@
         <w:t xml:space="preserve">Scores use the activity's 1 to 5 scale, where 5 is highly feasible. The group's ranking across all six titles is carried in the final comparison table. </w:t>
       </w:r>
       <w:r>
-        <w:rPr>
-          <w:highlight w:val="yellow"/>
-        </w:rPr>
-        <w:t>[Scores carried over from TA1 for this title; Ralph should confirm.]</w:t>
+        <w:rPr/>
       </w:r>
     </w:p>
     <w:tbl>
@@ -31073,82 +30810,128 @@
     </w:p>
     <w:p>
       <w:pPr>
+        <w:keepNext/>
         <w:spacing w:before="120" w:after="40"/>
         <w:ind w:left="432" w:hanging="432"/>
       </w:pPr>
       <w:r>
+        <w:rPr/>
         <w:t>1.</w:t>
         <w:tab/>
       </w:r>
       <w:r>
         <w:rPr>
-          <w:highlight w:val="yellow"/>
+          <w:b/>
         </w:rPr>
-        <w:t>[Open slot: add one local literature here.]</w:t>
-      </w:r>
-    </w:p>
-    <w:p>
-      <w:pPr>
+        <w:t>Philippines: Dairy and Products Annual</w:t>
+      </w:r>
+    </w:p>
+    <w:p>
+      <w:pPr>
+        <w:spacing w:after="40"/>
+        <w:ind w:left="432"/>
+        <w:jc w:val="both"/>
+      </w:pPr>
+      <w:r>
+        <w:rPr>
+          <w:b/>
+        </w:rPr>
+        <w:t>Description / Summary (Local Literature).</w:t>
+      </w:r>
+      <w:r>
+        <w:rPr/>
+        <w:t xml:space="preserve"> The U.S. Department of Agriculture's Foreign Agricultural Service office in Manila reports that the Philippines produces only about one percent of its dairy requirement and imports the rest. Local production supplies only about 20 percent of ready-to-drink milk, with imported UHT milk covering most of the demand, and demand for ready-to-drink milk is forecast to grow 3 percent in 2025, driven by the Milk Feeding Program and the expanding food service sector.</w:t>
+      </w:r>
+    </w:p>
+    <w:p>
+      <w:pPr>
+        <w:spacing w:after="40"/>
+        <w:ind w:left="432"/>
+        <w:jc w:val="both"/>
+      </w:pPr>
+      <w:r>
+        <w:rPr>
+          <w:b/>
+        </w:rPr>
+        <w:t>Relevance to the proposed study.</w:t>
+      </w:r>
+      <w:r>
+        <w:rPr/>
+        <w:t xml:space="preserve"> It shows that milk is a steady and growing retail category in the Philippines, and that most ready-to-drink milk sold in the country is imported stock with a limited shelf life, so milk left unsold before expiry is a direct loss to the retailer. This supports milk as the product focus of the study.</w:t>
+      </w:r>
+    </w:p>
+    <w:p>
+      <w:pPr>
+        <w:spacing w:after="40"/>
+        <w:ind w:left="432"/>
+        <w:jc w:val="left"/>
+      </w:pPr>
+      <w:r>
+        <w:rPr/>
+        <w:t>Source: https://apps.fas.usda.gov/newgainapi/api/Report/DownloadReportByFileName?fileName=Dairy+and+Products+Annual_Manila_Philippines_RP2024-0038.pdf</w:t>
+      </w:r>
+    </w:p>
+    <w:p>
+      <w:pPr>
+        <w:keepNext/>
         <w:spacing w:before="120" w:after="40"/>
         <w:ind w:left="432" w:hanging="432"/>
       </w:pPr>
       <w:r>
+        <w:rPr/>
         <w:t>2.</w:t>
         <w:tab/>
       </w:r>
       <w:r>
         <w:rPr>
-          <w:highlight w:val="yellow"/>
+          <w:b/>
         </w:rPr>
-        <w:t>[Open slot: add one local literature here.]</w:t>
-      </w:r>
-    </w:p>
-    <w:p>
-      <w:pPr>
-        <w:spacing w:before="120" w:after="40"/>
-        <w:ind w:left="432" w:hanging="432"/>
-      </w:pPr>
-      <w:r>
-        <w:t>3.</w:t>
-        <w:tab/>
-      </w:r>
+        <w:t>Food Loss and Waste in the Philippines: A Literature Review</w:t>
+      </w:r>
+    </w:p>
+    <w:p>
+      <w:pPr>
+        <w:spacing w:after="40"/>
+        <w:ind w:left="432"/>
+        <w:jc w:val="both"/>
+      </w:pPr>
       <w:r>
         <w:rPr>
-          <w:highlight w:val="yellow"/>
+          <w:b/>
         </w:rPr>
-        <w:t>[Open slot: add one local literature here.]</w:t>
-      </w:r>
-    </w:p>
-    <w:p>
-      <w:pPr>
-        <w:spacing w:before="120" w:after="40"/>
-        <w:ind w:left="432" w:hanging="432"/>
-      </w:pPr>
-      <w:r>
-        <w:t>4.</w:t>
-        <w:tab/>
-      </w:r>
+        <w:t>Description / Summary (Local Literature).</w:t>
+      </w:r>
+      <w:r>
+        <w:rPr/>
+        <w:t xml:space="preserve"> Barrion, Calayag, Nguyen-Orca, and Melo-Rijik (2023) reviewed the current state of food loss and waste in the Philippines along the supply chain and the Food Waste Reduction Act. Among the recommendations for the food industry, they list strict first-in, first-out practice to minimise spoilage.</w:t>
+      </w:r>
+    </w:p>
+    <w:p>
+      <w:pPr>
+        <w:spacing w:after="40"/>
+        <w:ind w:left="432"/>
+        <w:jc w:val="both"/>
+      </w:pPr>
       <w:r>
         <w:rPr>
-          <w:highlight w:val="yellow"/>
+          <w:b/>
         </w:rPr>
-        <w:t>[Open slot: add one local literature here.]</w:t>
-      </w:r>
-    </w:p>
-    <w:p>
-      <w:pPr>
-        <w:spacing w:before="120" w:after="40"/>
-        <w:ind w:left="432" w:hanging="432"/>
-      </w:pPr>
-      <w:r>
-        <w:t>5.</w:t>
-        <w:tab/>
-      </w:r>
-      <w:r>
-        <w:rPr>
-          <w:highlight w:val="yellow"/>
-        </w:rPr>
-        <w:t>[Open slot: add one local literature here.]</w:t>
+        <w:t>Relevance to the proposed study.</w:t>
+      </w:r>
+      <w:r>
+        <w:rPr/>
+        <w:t xml:space="preserve"> It is Philippine evidence that food waste is a recognised problem and that managing stock by its age is an accepted way to reduce it. The proposed study goes further by using remaining shelf life to set a price before the product becomes waste.</w:t>
+      </w:r>
+    </w:p>
+    <w:p>
+      <w:pPr>
+        <w:spacing w:after="40"/>
+        <w:ind w:left="432"/>
+        <w:jc w:val="left"/>
+      </w:pPr>
+      <w:r>
+        <w:rPr/>
+        <w:t>Source: https://doi.org/10.26656/fr.2017.7(6).127</w:t>
       </w:r>
     </w:p>
     <w:p>
@@ -31171,7 +30954,7 @@
         <w:ind w:left="432" w:hanging="432"/>
       </w:pPr>
       <w:r>
-        <w:t>6.</w:t>
+        <w:t>3.</w:t>
         <w:tab/>
       </w:r>
       <w:r>
@@ -31214,7 +30997,7 @@
         <w:ind w:left="432" w:hanging="432"/>
       </w:pPr>
       <w:r>
-        <w:t>7.</w:t>
+        <w:t>4.</w:t>
         <w:tab/>
       </w:r>
       <w:r>
@@ -31257,7 +31040,7 @@
         <w:ind w:left="432" w:hanging="432"/>
       </w:pPr>
       <w:r>
-        <w:t>8.</w:t>
+        <w:t>5.</w:t>
         <w:tab/>
       </w:r>
       <w:r>
@@ -31295,32 +31078,20 @@
     </w:p>
     <w:p>
       <w:pPr>
-        <w:spacing w:after="40"/>
-        <w:ind w:left="432"/>
-        <w:jc w:val="both"/>
-      </w:pPr>
-      <w:r>
-        <w:rPr>
-          <w:highlight w:val="yellow"/>
-        </w:rPr>
-        <w:t>[Name the authors: Yavuz and Kaya (2024), Applied Soft Computing, 163, 111864.]</w:t>
-      </w:r>
-    </w:p>
-    <w:p>
-      <w:pPr>
         <w:keepNext/>
         <w:spacing w:before="120" w:after="40"/>
         <w:ind w:left="432" w:hanging="432"/>
       </w:pPr>
       <w:r>
-        <w:t>9.</w:t>
+        <w:rPr/>
+        <w:t>6.</w:t>
         <w:tab/>
       </w:r>
       <w:r>
         <w:rPr>
           <w:b/>
         </w:rPr>
-        <w:t>Perishable Inventory and Remaining Shelf Life</w:t>
+        <w:t>A New Dynamic Pricing Model for the Effective Sustainability of Perishable Product Life Cycle</w:t>
       </w:r>
     </w:p>
     <w:p>
@@ -31336,7 +31107,25 @@
         <w:t>Description / Summary (Foreign Literature).</w:t>
       </w:r>
       <w:r>
-        <w:t xml:space="preserve"> Recent research on perishable inventory emphasizes that these products cannot be managed in the same way as non-perishable goods. Their limited selling periods create a relationship among inventory age, demand, pricing, and potential waste. This supports the proposed study's decision to include remaining shelf life as part of the information used for demand forecasting and price optimization.</w:t>
+        <w:rPr/>
+        <w:t xml:space="preserve"> Tekin and Erol (2017) argue that much of the perishable stock that supermarkets throw away is caused by pricing policies that ignore product age, not only by over-ordering. They develop a pricing policy for stock whose shelf life is about to expire, so that it still sells against fresher stock, with the aims of reducing waste cost and increasing supermarket profit.</w:t>
+      </w:r>
+    </w:p>
+    <w:p>
+      <w:pPr>
+        <w:spacing w:after="40"/>
+        <w:ind w:left="432"/>
+        <w:jc w:val="both"/>
+      </w:pPr>
+      <w:r>
+        <w:rPr>
+          <w:b/>
+        </w:rPr>
+        <w:t>Relevance to the proposed study.</w:t>
+      </w:r>
+      <w:r>
+        <w:rPr/>
+        <w:t xml:space="preserve"> It directly supports using remaining shelf life as an input to pricing, which is the core of the proposed price optimization for milk products.</w:t>
       </w:r>
     </w:p>
     <w:p>
@@ -31346,36 +31135,8 @@
         <w:jc w:val="left"/>
       </w:pPr>
       <w:r>
-        <w:t>Source: https://doi.org/10.1287/mnsc.2021.4011 , https://doi.org/10.1016/j.asoc.2024.111864</w:t>
-      </w:r>
-    </w:p>
-    <w:p>
-      <w:pPr>
-        <w:spacing w:after="40"/>
-        <w:ind w:left="432"/>
-        <w:jc w:val="both"/>
-      </w:pPr>
-      <w:r>
-        <w:rPr>
-          <w:highlight w:val="yellow"/>
-        </w:rPr>
-        <w:t>[This entry reuses the two DOIs above rather than citing a new source. Replace it with a distinct source.]</w:t>
-      </w:r>
-    </w:p>
-    <w:p>
-      <w:pPr>
-        <w:spacing w:before="120" w:after="40"/>
-        <w:ind w:left="432" w:hanging="432"/>
-      </w:pPr>
-      <w:r>
-        <w:t>10.</w:t>
-        <w:tab/>
-      </w:r>
-      <w:r>
-        <w:rPr>
-          <w:highlight w:val="yellow"/>
-        </w:rPr>
-        <w:t>[Open slot: add one foreign literature here.]</w:t>
+        <w:rPr/>
+        <w:t>Source: https://doi.org/10.3390/su9081330</w:t>
       </w:r>
     </w:p>
     <w:p>
@@ -31418,82 +31179,18 @@
     </w:p>
     <w:p>
       <w:pPr>
-        <w:spacing w:before="120" w:after="40"/>
-        <w:ind w:left="432" w:hanging="432"/>
-      </w:pPr>
-      <w:r>
-        <w:t>1.</w:t>
-        <w:tab/>
-      </w:r>
+        <w:spacing w:after="40"/>
+        <w:ind w:left="432"/>
+        <w:jc w:val="both"/>
+      </w:pPr>
       <w:r>
         <w:rPr>
-          <w:highlight w:val="yellow"/>
+          <w:b/>
         </w:rPr>
-        <w:t>[Open slot: add one local study here.]</w:t>
-      </w:r>
-    </w:p>
-    <w:p>
-      <w:pPr>
-        <w:spacing w:before="120" w:after="40"/>
-        <w:ind w:left="432" w:hanging="432"/>
-      </w:pPr>
-      <w:r>
-        <w:t>2.</w:t>
-        <w:tab/>
-      </w:r>
-      <w:r>
-        <w:rPr>
-          <w:highlight w:val="yellow"/>
-        </w:rPr>
-        <w:t>[Open slot: add one local study here.]</w:t>
-      </w:r>
-    </w:p>
-    <w:p>
-      <w:pPr>
-        <w:spacing w:before="120" w:after="40"/>
-        <w:ind w:left="432" w:hanging="432"/>
-      </w:pPr>
-      <w:r>
-        <w:t>3.</w:t>
-        <w:tab/>
-      </w:r>
-      <w:r>
-        <w:rPr>
-          <w:highlight w:val="yellow"/>
-        </w:rPr>
-        <w:t>[Open slot: add one local study here.]</w:t>
-      </w:r>
-    </w:p>
-    <w:p>
-      <w:pPr>
-        <w:spacing w:before="120" w:after="40"/>
-        <w:ind w:left="432" w:hanging="432"/>
-      </w:pPr>
-      <w:r>
-        <w:t>4.</w:t>
-        <w:tab/>
-      </w:r>
-      <w:r>
-        <w:rPr>
-          <w:highlight w:val="yellow"/>
-        </w:rPr>
-        <w:t>[Open slot: add one local study here.]</w:t>
-      </w:r>
-    </w:p>
-    <w:p>
-      <w:pPr>
-        <w:spacing w:before="120" w:after="40"/>
-        <w:ind w:left="432" w:hanging="432"/>
-      </w:pPr>
-      <w:r>
-        <w:t>5.</w:t>
-        <w:tab/>
-      </w:r>
-      <w:r>
-        <w:rPr>
-          <w:highlight w:val="yellow"/>
-        </w:rPr>
-        <w:t>[Open slot: add one local study here.]</w:t>
+      </w:r>
+      <w:r>
+        <w:rPr/>
+        <w:t>No Philippine study on demand forecasting or dynamic pricing for milk retail was found in the group's search, which is part of the gap this study addresses.</w:t>
       </w:r>
     </w:p>
     <w:p>
@@ -31516,7 +31213,7 @@
         <w:ind w:left="432" w:hanging="432"/>
       </w:pPr>
       <w:r>
-        <w:t>6.</w:t>
+        <w:t>1.</w:t>
         <w:tab/>
       </w:r>
       <w:r>
@@ -31575,7 +31272,7 @@
         <w:ind w:left="432" w:hanging="432"/>
       </w:pPr>
       <w:r>
-        <w:t>7.</w:t>
+        <w:t>2.</w:t>
         <w:tab/>
       </w:r>
       <w:r>
@@ -31634,7 +31331,7 @@
         <w:ind w:left="432" w:hanging="432"/>
       </w:pPr>
       <w:r>
-        <w:t>8.</w:t>
+        <w:t>3.</w:t>
         <w:tab/>
       </w:r>
       <w:r>
@@ -31688,34 +31385,128 @@
     </w:p>
     <w:p>
       <w:pPr>
+        <w:keepNext/>
         <w:spacing w:before="120" w:after="40"/>
         <w:ind w:left="432" w:hanging="432"/>
       </w:pPr>
       <w:r>
-        <w:t>9.</w:t>
+        <w:rPr/>
+        <w:t>4.</w:t>
         <w:tab/>
       </w:r>
       <w:r>
         <w:rPr>
-          <w:highlight w:val="yellow"/>
+          <w:b/>
         </w:rPr>
-        <w:t>[Open slot: add one foreign study here.]</w:t>
-      </w:r>
-    </w:p>
-    <w:p>
-      <w:pPr>
+        <w:t>Augmented Data and XGBoost Improvement for Sales Forecasting in the Large-Scale Retail Sector</w:t>
+      </w:r>
+    </w:p>
+    <w:p>
+      <w:pPr>
+        <w:spacing w:after="40"/>
+        <w:ind w:left="432"/>
+        <w:jc w:val="both"/>
+      </w:pPr>
+      <w:r>
+        <w:rPr>
+          <w:b/>
+        </w:rPr>
+        <w:t>Description / Summary (Foreign Study).</w:t>
+      </w:r>
+      <w:r>
+        <w:rPr/>
+        <w:t xml:space="preserve"> Massaro, Panarese, Giannone, and Galiano (2021) applied XGBoost in an industrial project for a large-scale retailer to predict product sales, including under promotion conditions. Because the available data were not enough to reach the accuracy they needed, they trained and tested the model with an augmented data technique.</w:t>
+      </w:r>
+    </w:p>
+    <w:p>
+      <w:pPr>
+        <w:spacing w:after="40"/>
+        <w:ind w:left="432"/>
+        <w:jc w:val="both"/>
+      </w:pPr>
+      <w:r>
+        <w:rPr>
+          <w:b/>
+        </w:rPr>
+        <w:t>Relevance to the proposed study.</w:t>
+      </w:r>
+      <w:r>
+        <w:rPr/>
+        <w:t xml:space="preserve"> It shows XGBoost, the primary model named in the title, working on retail sales forecasting, and it offers a way forward if the partner store's sales history turns out to be short.</w:t>
+      </w:r>
+    </w:p>
+    <w:p>
+      <w:pPr>
+        <w:spacing w:after="40"/>
+        <w:ind w:left="432"/>
+        <w:jc w:val="left"/>
+      </w:pPr>
+      <w:r>
+        <w:rPr/>
+        <w:t>Source: https://doi.org/10.3390/app11177793</w:t>
+      </w:r>
+    </w:p>
+    <w:p>
+      <w:pPr>
+        <w:keepNext/>
         <w:spacing w:before="120" w:after="40"/>
         <w:ind w:left="432" w:hanging="432"/>
       </w:pPr>
       <w:r>
-        <w:t>10.</w:t>
+        <w:rPr/>
+        <w:t>5.</w:t>
         <w:tab/>
       </w:r>
       <w:r>
         <w:rPr>
-          <w:highlight w:val="yellow"/>
+          <w:b/>
         </w:rPr>
-        <w:t>[Open slot: add one foreign study here.]</w:t>
+        <w:t>Analytics for an Online Retailer: Demand Forecasting and Price Optimization</w:t>
+      </w:r>
+    </w:p>
+    <w:p>
+      <w:pPr>
+        <w:spacing w:after="40"/>
+        <w:ind w:left="432"/>
+        <w:jc w:val="both"/>
+      </w:pPr>
+      <w:r>
+        <w:rPr>
+          <w:b/>
+        </w:rPr>
+        <w:t>Description / Summary (Foreign Study).</w:t>
+      </w:r>
+      <w:r>
+        <w:rPr/>
+        <w:t xml:space="preserve"> Ferreira, Lee, and Simchi-Levi (2016) worked with the online retailer Rue La La, which prices limited-time sales of products it has never sold before. They used machine learning to estimate lost sales and forecast demand, then turned those forecasts into daily pricing decisions through an optimization algorithm.</w:t>
+      </w:r>
+    </w:p>
+    <w:p>
+      <w:pPr>
+        <w:spacing w:after="40"/>
+        <w:ind w:left="432"/>
+        <w:jc w:val="both"/>
+      </w:pPr>
+      <w:r>
+        <w:rPr>
+          <w:b/>
+        </w:rPr>
+        <w:t>Relevance to the proposed study.</w:t>
+      </w:r>
+      <w:r>
+        <w:rPr/>
+        <w:t xml:space="preserve"> It is a model for the study's two-stage design, in which a demand forecast feeds a price optimization step, applied here to milk products with a remaining shelf-life constraint.</w:t>
+      </w:r>
+    </w:p>
+    <w:p>
+      <w:pPr>
+        <w:spacing w:after="40"/>
+        <w:ind w:left="432"/>
+        <w:jc w:val="left"/>
+      </w:pPr>
+      <w:r>
+        <w:rPr/>
+        <w:t>Source: https://doi.org/10.1287/msom.2015.0561</w:t>
       </w:r>
     </w:p>
     <w:p>
@@ -31755,10 +31546,7 @@
         <w:t xml:space="preserve"> The reviewed work comes from large foreign retailers and uses methods that are complex to deploy. It does not offer Philippine small and medium retailers an accessible tool that forecasts milk demand with supervised models and turns remaining shelf life into a pricing recommendation. </w:t>
       </w:r>
       <w:r>
-        <w:rPr>
-          <w:highlight w:val="yellow"/>
-        </w:rPr>
-        <w:t>[Title 5 still has no Philippine source; local literature and local studies are needed to support this gap.]</w:t>
+        <w:rPr/>
       </w:r>
     </w:p>
     <w:p>
@@ -31809,7 +31597,8 @@
         <w:jc w:val="left"/>
       </w:pPr>
       <w:r>
-        <w:t>Ferreira, K. J., Lee, B. H. A., &amp; Simchi-Levi, D. (2016). Analytics for an online retailer: Demand forecasting and price optimization. Manufacturing &amp; Service Operations Management, 18(1), 69-88. https://doi.org/10.1287/msom.2015.0561</w:t>
+        <w:rPr/>
+        <w:t>Barrion, A. S. A., Calayag, J. A. S., Nguyen-Orca, M. F. R., &amp; Melo-Rijik, M. N. (2023). Food loss and waste in the Philippines: A literature review. Food Research, 7(6), 278-289. https://doi.org/10.26656/fr.2017.7(6).127</w:t>
       </w:r>
     </w:p>
     <w:p>
@@ -31819,7 +31608,7 @@
         <w:jc w:val="left"/>
       </w:pPr>
       <w:r>
-        <w:t>Inokuma, M., Ikeda, S., &amp; Takano, Y. (2026). Estimating profitable price bounds for prescriptive price optimization. Discover Analytics, 4, Article 21. https://doi.org/10.1007/s44257-026-00072-7</w:t>
+        <w:t>Ferreira, K. J., Lee, B. H. A., &amp; Simchi-Levi, D. (2016). Analytics for an online retailer: Demand forecasting and price optimization. Manufacturing &amp; Service Operations Management, 18(1), 69-88. https://doi.org/10.1287/msom.2015.0561</w:t>
       </w:r>
     </w:p>
     <w:p>
@@ -31829,7 +31618,7 @@
         <w:jc w:val="left"/>
       </w:pPr>
       <w:r>
-        <w:t>Keskin, N. B., Li, Y., &amp; Song, J.-S. (2022). Data-driven dynamic pricing and ordering with perishable inventory in a changing environment. Management Science. https://doi.org/10.1287/mnsc.2021.4011</w:t>
+        <w:t>Inokuma, M., Ikeda, S., &amp; Takano, Y. (2026). Estimating profitable price bounds for prescriptive price optimization. Discover Analytics, 4, Article 21. https://doi.org/10.1007/s44257-026-00072-7</w:t>
       </w:r>
     </w:p>
     <w:p>
@@ -31839,7 +31628,8 @@
         <w:jc w:val="left"/>
       </w:pPr>
       <w:r>
-        <w:t>Liu, C., &amp; Sustik, M. A. (2021). Elasticity based demand forecasting and price optimization for online retail. arXiv. https://arxiv.org/abs/2106.08274</w:t>
+        <w:rPr/>
+        <w:t>Keskin, N. B., Li, Y., &amp; Song, J.-S. (2022). Data-driven dynamic pricing and ordering with perishable inventory in a changing environment. Management Science, 68(3), 1938-1958. https://doi.org/10.1287/mnsc.2021.4011</w:t>
       </w:r>
     </w:p>
     <w:p>
@@ -31849,7 +31639,7 @@
         <w:jc w:val="left"/>
       </w:pPr>
       <w:r>
-        <w:t>Massaro, A., Panarese, A., Giannone, D., &amp; Galiano, A. (2021). Augmented data and XGBoost improvement for sales forecasting in the large-scale retail sector. Applied Sciences, 11(17), 7793. https://doi.org/10.3390/app11177793</w:t>
+        <w:t>Liu, C., &amp; Sustik, M. A. (2021). Elasticity based demand forecasting and price optimization for online retail. arXiv. https://arxiv.org/abs/2106.08274</w:t>
       </w:r>
     </w:p>
     <w:p>
@@ -31859,16 +31649,7 @@
         <w:jc w:val="left"/>
       </w:pPr>
       <w:r>
-        <w:t xml:space="preserve">Syed, </w:t>
-      </w:r>
-      <w:r>
-        <w:rPr>
-          <w:highlight w:val="yellow"/>
-        </w:rPr>
-        <w:t>[initials]</w:t>
-      </w:r>
-      <w:r>
-        <w:t>, et al. (2024). Dynamic pricing for perishable goods: A data-driven digital transformation approach. International Journal of Production Economics, 109405. https://doi.org/10.1016/j.ijpe.2024.109405</w:t>
+        <w:t>Massaro, A., Panarese, A., Giannone, D., &amp; Galiano, A. (2021). Augmented data and XGBoost improvement for sales forecasting in the large-scale retail sector. Applied Sciences, 11(17), 7793. https://doi.org/10.3390/app11177793</w:t>
       </w:r>
     </w:p>
     <w:p>
@@ -31878,7 +31659,8 @@
         <w:jc w:val="left"/>
       </w:pPr>
       <w:r>
-        <w:t>XGBoost Developers. (n.d.). XGBoost parameters. XGBoost Documentation. https://xgboost.readthedocs.io/en/latest/parameter.html</w:t>
+        <w:rPr/>
+        <w:t>Syed, T. A., Aslam, H., Bhatti, Z. A., Mehmood, F., &amp; Pahuja, A. (2024). Dynamic pricing for perishable goods: A data-driven digital transformation approach. International Journal of Production Economics, 277, 109405. https://doi.org/10.1016/j.ijpe.2024.109405</w:t>
       </w:r>
     </w:p>
     <w:p>
@@ -31888,25 +31670,40 @@
         <w:jc w:val="left"/>
       </w:pPr>
       <w:r>
-        <w:t xml:space="preserve">Yavuz, </w:t>
-      </w:r>
-      <w:r>
-        <w:rPr>
-          <w:highlight w:val="yellow"/>
-        </w:rPr>
-        <w:t>[initials]</w:t>
-      </w:r>
-      <w:r>
-        <w:t xml:space="preserve">, &amp; Kaya, </w:t>
-      </w:r>
-      <w:r>
-        <w:rPr>
-          <w:highlight w:val="yellow"/>
-        </w:rPr>
-        <w:t>[initials]</w:t>
-      </w:r>
-      <w:r>
-        <w:t>. (2024). Deep reinforcement learning algorithms for dynamic pricing and inventory management of perishable products. Applied Soft Computing, 163, 111864. https://doi.org/10.1016/j.asoc.2024.111864</w:t>
+        <w:rPr/>
+        <w:t>Tekin, P., &amp; Erol, R. (2017). A new dynamic pricing model for the effective sustainability of perishable product life cycle. Sustainability, 9(8), 1330. https://doi.org/10.3390/su9081330</w:t>
+      </w:r>
+    </w:p>
+    <w:p>
+      <w:pPr>
+        <w:spacing w:after="60"/>
+        <w:ind w:left="576" w:hanging="576"/>
+        <w:jc w:val="left"/>
+      </w:pPr>
+      <w:r>
+        <w:rPr/>
+        <w:t>U.S. Department of Agriculture Foreign Agricultural Service. (2024). Philippines: Dairy and products annual (Report No. RP2024-0038). https://apps.fas.usda.gov/newgainapi/api/Report/DownloadReportByFileName?fileName=Dairy+and+Products+Annual_Manila_Philippines_RP2024-0038.pdf</w:t>
+      </w:r>
+    </w:p>
+    <w:p>
+      <w:pPr>
+        <w:spacing w:after="60"/>
+        <w:ind w:left="576" w:hanging="576"/>
+        <w:jc w:val="left"/>
+      </w:pPr>
+      <w:r>
+        <w:t>XGBoost Developers. (n.d.). XGBoost parameters. XGBoost Documentation. https://xgboost.readthedocs.io/en/latest/parameter.html</w:t>
+      </w:r>
+    </w:p>
+    <w:p>
+      <w:pPr>
+        <w:spacing w:after="60"/>
+        <w:ind w:left="576" w:hanging="576"/>
+        <w:jc w:val="left"/>
+      </w:pPr>
+      <w:r>
+        <w:rPr/>
+        <w:t>Yavuz, T., &amp; Kaya, O. (2024). Deep reinforcement learning algorithms for dynamic pricing and inventory management of perishable products. Applied Soft Computing, 163, 111864. https://doi.org/10.1016/j.asoc.2024.111864</w:t>
       </w:r>
     </w:p>
     <w:p>
@@ -36963,22 +36760,6 @@
     </w:p>
     <w:p>
       <w:pPr>
-        <w:spacing w:before="120" w:after="40"/>
-        <w:ind w:left="432" w:hanging="432"/>
-      </w:pPr>
-      <w:r>
-        <w:t>5.</w:t>
-        <w:tab/>
-      </w:r>
-      <w:r>
-        <w:rPr>
-          <w:highlight w:val="yellow"/>
-        </w:rPr>
-        <w:t>[Open slot: add one local literature here.]</w:t>
-      </w:r>
-    </w:p>
-    <w:p>
-      <w:pPr>
         <w:keepNext/>
         <w:spacing w:before="80" w:after="80"/>
       </w:pPr>
@@ -36997,7 +36778,7 @@
         <w:ind w:left="432" w:hanging="432"/>
       </w:pPr>
       <w:r>
-        <w:t>6.</w:t>
+        <w:t>5.</w:t>
         <w:tab/>
       </w:r>
       <w:r>
@@ -37056,7 +36837,7 @@
         <w:ind w:left="432" w:hanging="432"/>
       </w:pPr>
       <w:r>
-        <w:t>7.</w:t>
+        <w:t>6.</w:t>
         <w:tab/>
       </w:r>
       <w:r>
@@ -37106,54 +36887,6 @@
       </w:pPr>
       <w:r>
         <w:t>Source: https://doi.org/10.1016/j.jbi.2015.07.020</w:t>
-      </w:r>
-    </w:p>
-    <w:p>
-      <w:pPr>
-        <w:spacing w:before="120" w:after="40"/>
-        <w:ind w:left="432" w:hanging="432"/>
-      </w:pPr>
-      <w:r>
-        <w:t>8.</w:t>
-        <w:tab/>
-      </w:r>
-      <w:r>
-        <w:rPr>
-          <w:highlight w:val="yellow"/>
-        </w:rPr>
-        <w:t>[Open slot: add one foreign literature here.]</w:t>
-      </w:r>
-    </w:p>
-    <w:p>
-      <w:pPr>
-        <w:spacing w:before="120" w:after="40"/>
-        <w:ind w:left="432" w:hanging="432"/>
-      </w:pPr>
-      <w:r>
-        <w:t>9.</w:t>
-        <w:tab/>
-      </w:r>
-      <w:r>
-        <w:rPr>
-          <w:highlight w:val="yellow"/>
-        </w:rPr>
-        <w:t>[Open slot: add one foreign literature here.]</w:t>
-      </w:r>
-    </w:p>
-    <w:p>
-      <w:pPr>
-        <w:spacing w:before="120" w:after="40"/>
-        <w:ind w:left="432" w:hanging="432"/>
-      </w:pPr>
-      <w:r>
-        <w:t>10.</w:t>
-        <w:tab/>
-      </w:r>
-      <w:r>
-        <w:rPr>
-          <w:highlight w:val="yellow"/>
-        </w:rPr>
-        <w:t>[Open slot: add one foreign literature here.]</w:t>
       </w:r>
     </w:p>
     <w:p>
@@ -37255,70 +36988,6 @@
     </w:p>
     <w:p>
       <w:pPr>
-        <w:spacing w:before="120" w:after="40"/>
-        <w:ind w:left="432" w:hanging="432"/>
-      </w:pPr>
-      <w:r>
-        <w:t>2.</w:t>
-        <w:tab/>
-      </w:r>
-      <w:r>
-        <w:rPr>
-          <w:highlight w:val="yellow"/>
-        </w:rPr>
-        <w:t>[Open slot: add one local study here.]</w:t>
-      </w:r>
-    </w:p>
-    <w:p>
-      <w:pPr>
-        <w:spacing w:before="120" w:after="40"/>
-        <w:ind w:left="432" w:hanging="432"/>
-      </w:pPr>
-      <w:r>
-        <w:t>3.</w:t>
-        <w:tab/>
-      </w:r>
-      <w:r>
-        <w:rPr>
-          <w:highlight w:val="yellow"/>
-        </w:rPr>
-        <w:t>[Open slot: add one local study here.]</w:t>
-      </w:r>
-    </w:p>
-    <w:p>
-      <w:pPr>
-        <w:spacing w:before="120" w:after="40"/>
-        <w:ind w:left="432" w:hanging="432"/>
-      </w:pPr>
-      <w:r>
-        <w:t>4.</w:t>
-        <w:tab/>
-      </w:r>
-      <w:r>
-        <w:rPr>
-          <w:highlight w:val="yellow"/>
-        </w:rPr>
-        <w:t>[Open slot: add one local study here.]</w:t>
-      </w:r>
-    </w:p>
-    <w:p>
-      <w:pPr>
-        <w:spacing w:before="120" w:after="40"/>
-        <w:ind w:left="432" w:hanging="432"/>
-      </w:pPr>
-      <w:r>
-        <w:t>5.</w:t>
-        <w:tab/>
-      </w:r>
-      <w:r>
-        <w:rPr>
-          <w:highlight w:val="yellow"/>
-        </w:rPr>
-        <w:t>[Open slot: add one local study here.]</w:t>
-      </w:r>
-    </w:p>
-    <w:p>
-      <w:pPr>
         <w:keepNext/>
         <w:spacing w:before="80" w:after="80"/>
       </w:pPr>
@@ -37337,7 +37006,7 @@
         <w:ind w:left="432" w:hanging="432"/>
       </w:pPr>
       <w:r>
-        <w:t>6.</w:t>
+        <w:t>2.</w:t>
         <w:tab/>
       </w:r>
       <w:r>
@@ -37396,7 +37065,7 @@
         <w:ind w:left="432" w:hanging="432"/>
       </w:pPr>
       <w:r>
-        <w:t>7.</w:t>
+        <w:t>3.</w:t>
         <w:tab/>
       </w:r>
       <w:r>
@@ -37455,7 +37124,7 @@
         <w:ind w:left="432" w:hanging="432"/>
       </w:pPr>
       <w:r>
-        <w:t>8.</w:t>
+        <w:t>4.</w:t>
         <w:tab/>
       </w:r>
       <w:r>
@@ -37514,7 +37183,7 @@
         <w:ind w:left="432" w:hanging="432"/>
       </w:pPr>
       <w:r>
-        <w:t>9.</w:t>
+        <w:t>5.</w:t>
         <w:tab/>
       </w:r>
       <w:r>
@@ -37564,22 +37233,6 @@
       </w:pPr>
       <w:r>
         <w:t>Source: https://arxiv.org/abs/2503.20794</w:t>
-      </w:r>
-    </w:p>
-    <w:p>
-      <w:pPr>
-        <w:spacing w:before="120" w:after="40"/>
-        <w:ind w:left="432" w:hanging="432"/>
-      </w:pPr>
-      <w:r>
-        <w:t>10.</w:t>
-        <w:tab/>
-      </w:r>
-      <w:r>
-        <w:rPr>
-          <w:highlight w:val="yellow"/>
-        </w:rPr>
-        <w:t>[Open slot: add one foreign study here.]</w:t>
       </w:r>
     </w:p>
     <w:p>
@@ -38914,10 +38567,8 @@
         <w:t xml:space="preserve">Why the ranking is not simply the score order. The scores measure how safely a title can be delivered, not what the study contributes or whom it serves. Title 1 is placed first because it remains the group's committed direction, because BAPTC and DA-CAR have both acknowledged the group's requests, and because it addresses a Philippine market that no publicly identified study has modelled for price and supply glut together. Title 3 is placed second and kept as the backup title, because it is the direction the professor responded to most strongly and because its method can be validated on public benchmark data while the city's reply is pending. </w:t>
       </w:r>
       <w:r>
-        <w:rPr>
-          <w:highlight w:val="yellow"/>
-        </w:rPr>
-        <w:t>[Add the group's reasons for placing Title 5 third, Title 2 fourth, Title 4 fifth, and Title 6 sixth.]</w:t>
+        <w:rPr/>
+        <w:t>Title 5 is placed third because the group is more certain that it can secure both a dataset and a partner retailer for it, and because it does not depend on an institution agreeing to release records. Title 2 is placed fourth. The group has a closer contact at SM Foundation and reaching the client is easier than for most titles, but the partnership is still uncertain. Title 4 is placed fifth, below Title 2, because child immunization records are health data, which in the Philippines are highly confidential and among the hardest records to obtain. The group is still looking for a partner health center, and reaching 10,000 records from a single center is itself difficult. Title 6 is placed sixth despite having the highest total, because it is kept only as a fallback behind the backup title rather than as a direction the group intends to pursue.</w:t>
       </w:r>
     </w:p>
     <w:tbl>
@@ -38957,12 +38608,34 @@
                 <w:color w:val="E0E0E0"/>
                 <w:sz w:val="18"/>
               </w:rPr>
-              <w:t>Primary title, supporting decisions, and backup title</w:t>
+              <w:t>The group's ranking of the titles, justified from each title's RRL and RRS</w:t>
             </w:r>
           </w:p>
         </w:tc>
       </w:tr>
     </w:tbl>
+    <w:p>
+      <w:pPr>
+        <w:spacing w:after="40"/>
+      </w:pPr>
+    </w:p>
+    <w:p>
+      <w:pPr>
+        <w:spacing w:after="40"/>
+      </w:pPr>
+      <w:r>
+        <w:rPr>
+          <w:b/>
+        </w:rPr>
+        <w:t xml:space="preserve">How the ranking was decided. </w:t>
+      </w:r>
+      <w:r>
+        <w:rPr>
+          <w:b w:val="0"/>
+        </w:rPr>
+        <w:t>The group ranked the titles itself. The feasibility scores in the comparison table measure how safely each title can be delivered, but the ranking also weighs which titles the group is committed to, which partner the group can realistically secure, how sensitive and obtainable each dataset is, and how strongly each title's review of related literature and studies supports its problem and its method. Each title below is given with its role, the reason for its rank, what its RRL and RRS establish, the research gap it fills, and the condition under which the group would move to it. The group pursues the first title and moves down the list only when the title above it fails its data decision gate.</w:t>
+      </w:r>
+    </w:p>
     <w:p>
       <w:pPr>
         <w:spacing w:after="40"/>
@@ -38991,7 +38664,7 @@
                 <w:b/>
                 <w:sz w:val="18"/>
               </w:rPr>
-              <w:t>Item</w:t>
+              <w:t>Rank 1: Primary Recommended Title</w:t>
             </w:r>
           </w:p>
         </w:tc>
@@ -39006,7 +38679,7 @@
                 <w:b/>
                 <w:sz w:val="18"/>
               </w:rPr>
-              <w:t>Decision</w:t>
+              <w:t>Highland Vegetable Price and Supply Glut Forecasting at the Benguet Agri-Pinoy Trading Center Using XGBoost</w:t>
             </w:r>
           </w:p>
         </w:tc>
@@ -39019,9 +38692,10 @@
           <w:p>
             <w:r>
               <w:rPr>
-                <w:sz w:val="18"/>
-              </w:rPr>
-              <w:t>Primary recommended title</w:t>
+                <w:b/>
+                <w:sz w:val="18"/>
+              </w:rPr>
+              <w:t>Partner and data status</w:t>
             </w:r>
           </w:p>
         </w:tc>
@@ -39032,9 +38706,10 @@
           <w:p>
             <w:r>
               <w:rPr>
-                <w:sz w:val="18"/>
-              </w:rPr>
-              <w:t>Title 1: Highland Vegetable Price and Supply Glut Forecasting at the Benguet Agri-Pinoy Trading Center Using XGBoost</w:t>
+                <w:b w:val="0"/>
+                <w:sz w:val="18"/>
+              </w:rPr>
+              <w:t>BAPTC (Office of the General Manager) and DA-CAR AMAD. The formal request was sent on September 10, 2026 and acknowledged on September 14, 2026. BAPTC does not release raw or source files, so the request is for an aggregate extract of price and trading volume by commodity. DA-CAR AMAD replied that its concerned section will respond. DA Bantay Presyo bulletins and PAGASA-BSU weather records are public and already confirmed.</w:t>
             </w:r>
           </w:p>
         </w:tc>
@@ -39047,9 +38722,10 @@
           <w:p>
             <w:r>
               <w:rPr>
-                <w:sz w:val="18"/>
-              </w:rPr>
-              <w:t>Reasons for selecting the title</w:t>
+                <w:b/>
+                <w:sz w:val="18"/>
+              </w:rPr>
+              <w:t>Why it ranks first</w:t>
             </w:r>
           </w:p>
         </w:tc>
@@ -39060,9 +38736,46 @@
           <w:p>
             <w:r>
               <w:rPr>
-                <w:sz w:val="18"/>
-              </w:rPr>
-              <w:t>It is the group's committed direction; the BAPTC General Manager's office and DA-CAR AMAD have both acknowledged the group's requests; no publicly identified study has modelled price and supply-glut risk for this market; and it serves an identifiable group of beneficiaries, the farmers of Benguet.</w:t>
+                <w:b w:val="0"/>
+                <w:sz w:val="18"/>
+              </w:rPr>
+              <w:t>It is the group's committed direction, and both offices that hold the data have acknowledged the group's requests.</w:t>
+            </w:r>
+          </w:p>
+          <w:p>
+            <w:r>
+              <w:rPr>
+                <w:b w:val="0"/>
+                <w:sz w:val="18"/>
+              </w:rPr>
+              <w:t>Its research gap is the clearest of the five titles. The only BAPTC-specific price model found (Lubag et al., 2025) forecasts a single commodity's price and does not flag supply gluts, so a commodity-level early warning of price and glut risk does not yet exist for this market.</w:t>
+            </w:r>
+          </w:p>
+          <w:p>
+            <w:r>
+              <w:rPr>
+                <w:b w:val="0"/>
+                <w:sz w:val="18"/>
+              </w:rPr>
+              <w:t>The partner has already asked for this kind of tool. The Department of Agriculture (2021) frames farmer income at BAPTC as the problem to solve, and the Philippine Information Agency and OpenGov Asia both report DA-CAR moving BAPTC toward digital trading and artificial intelligence. The system fits a direction the agency has chosen.</w:t>
+            </w:r>
+          </w:p>
+          <w:p>
+            <w:r>
+              <w:rPr>
+                <w:b w:val="0"/>
+                <w:sz w:val="18"/>
+              </w:rPr>
+              <w:t>It serves an identifiable group of beneficiaries, the farmers of Benguet, for whom a price collapse after an overlapping harvest is a direct loss.</w:t>
+            </w:r>
+          </w:p>
+          <w:p>
+            <w:r>
+              <w:rPr>
+                <w:b w:val="0"/>
+                <w:sz w:val="18"/>
+              </w:rPr>
+              <w:t>Its main risk is bounded. Its feasibility total of 30 is the lowest, tied with Title 3, because the study waits on an institution releasing records. That risk is controlled by the Week 3 decision gate below: if volume data is withheld, the title narrows to price forecasting on public data instead of failing.</w:t>
             </w:r>
           </w:p>
         </w:tc>
@@ -39075,9 +38788,10 @@
           <w:p>
             <w:r>
               <w:rPr>
-                <w:sz w:val="18"/>
-              </w:rPr>
-              <w:t>Confirmed technology and platform</w:t>
+                <w:b/>
+                <w:sz w:val="18"/>
+              </w:rPr>
+              <w:t>What the RRL establishes</w:t>
             </w:r>
           </w:p>
         </w:tc>
@@ -39088,9 +38802,19 @@
           <w:p>
             <w:r>
               <w:rPr>
-                <w:sz w:val="18"/>
-              </w:rPr>
-              <w:t>Python with pandas, NumPy, statsmodels, scikit-learn, and XGBoost; PostgreSQL or SQLite; a Streamlit dashboard deployed locally or on a free tier. No external API on the critical path.</w:t>
+                <w:b w:val="0"/>
+                <w:sz w:val="18"/>
+              </w:rPr>
+              <w:t>Local literature. The Department of Agriculture (2021) describes BAPTC as the country's biggest vegetable trading facility. The Philippine Information Agency and OpenGov Asia confirm that digital market information at BAPTC is a live government priority. DA Bantay Presyo gives an independent public price series for cross-checking and for a price-only fallback. The approved FOI request for BAPTC programme documents shows what is publicly obtainable and supports framing the request around aggregates rather than raw records.</w:t>
+            </w:r>
+          </w:p>
+          <w:p>
+            <w:r>
+              <w:rPr>
+                <w:b w:val="0"/>
+                <w:sz w:val="18"/>
+              </w:rPr>
+              <w:t>Foreign literature. Hyndman and Athanasopoulos (2021) are the basis for rolling-origin validation and for requiring every model to beat naive and seasonal-naive forecasts. Chen and Guestrin (2016) show that XGBoost handles missing values and supports both regression and classification, which the price and glut tasks need. Qiao, Kang, and Ahn (2023) found that domestic production drove most vegetable price swings in South Korea, which is why BAPTC volume is essential for the glut claim. Mao et al. (2022) show that models trained on normal periods can fail during shocks, so error is reported by season. Haselbeck et al. (2022) found that machine learning outperformed classical forecasting on horticultural sales.</w:t>
             </w:r>
           </w:p>
         </w:tc>
@@ -39103,9 +38827,10 @@
           <w:p>
             <w:r>
               <w:rPr>
-                <w:sz w:val="18"/>
-              </w:rPr>
-              <w:t>Recommended algorithm or model</w:t>
+                <w:b/>
+                <w:sz w:val="18"/>
+              </w:rPr>
+              <w:t>What the RRS establishes</w:t>
             </w:r>
           </w:p>
         </w:tc>
@@ -39116,9 +38841,19 @@
           <w:p>
             <w:r>
               <w:rPr>
-                <w:sz w:val="18"/>
-              </w:rPr>
-              <w:t>XGBoost for price regression and glut-risk classification, against seasonal-naive, SARIMA, and random forest baselines under rolling-origin validation.</w:t>
+                <w:b w:val="0"/>
+                <w:sz w:val="18"/>
+              </w:rPr>
+              <w:t>Local studies. Lubag et al. (2025) forecast BAPTC lettuce prices with a bidirectional GRU (test R-squared of 0.95), which gives the study a benchmark but covers one commodity and no gluts. Quitaleg and Dumlao (2025) showed that Benguet production is forecastable and that supply-side data is the limiting factor. Hinlo and Lee (2026) found that demand explained 50 to 90 percent and supply shocks 9 to 50 percent of Philippine onion and garlic price variance, so price and supply have to be modelled together.</w:t>
+            </w:r>
+          </w:p>
+          <w:p>
+            <w:r>
+              <w:rPr>
+                <w:b w:val="0"/>
+                <w:sz w:val="18"/>
+              </w:rPr>
+              <w:t>Foreign studies. Li et al. (2024) reduced MAPE by 10 to 12 percent on 42 short-cycle vegetable products with a random forest and XGBoost model. Zeng, Gao, and Hu (2024) support a two-output design that forecasts price and volume separately. Nayak et al. (2024) found that weather inputs improved price forecasts, which is why PAGASA-BSU records are added. Paul et al. (2022) found that the best model differs by market, so XGBoost is benchmarked rather than assumed best. Bulut (2025) showed that trade volume makes forecasts more useful in practice.</w:t>
             </w:r>
           </w:p>
         </w:tc>
@@ -39131,9 +38866,10 @@
           <w:p>
             <w:r>
               <w:rPr>
-                <w:sz w:val="18"/>
-              </w:rPr>
-              <w:t>Confirmed dataset or data source</w:t>
+                <w:b/>
+                <w:sz w:val="18"/>
+              </w:rPr>
+              <w:t>Research gap it fills</w:t>
             </w:r>
           </w:p>
         </w:tc>
@@ -39144,9 +38880,10 @@
           <w:p>
             <w:r>
               <w:rPr>
-                <w:sz w:val="18"/>
-              </w:rPr>
-              <w:t>Not yet confirmed. BAPTC has said it does not release raw or source files, so the request is for an aggregate extract of price and trading volume. DA Bantay Presyo bulletins and PAGASA-BSU weather records are public and confirmed.</w:t>
+                <w:b w:val="0"/>
+                <w:sz w:val="18"/>
+              </w:rPr>
+              <w:t>Few studies forecast price and supply glut together, and none gives BAPTC or DA-CAR a commodity-level early warning of price movement and oversupply risk. The study delivers that warning as a staff-facing dashboard.</w:t>
             </w:r>
           </w:p>
         </w:tc>
@@ -39159,9 +38896,10 @@
           <w:p>
             <w:r>
               <w:rPr>
-                <w:sz w:val="18"/>
-              </w:rPr>
-              <w:t>Estimated cost and completion period</w:t>
+                <w:b/>
+                <w:sz w:val="18"/>
+              </w:rPr>
+              <w:t>Technology and platform</w:t>
             </w:r>
           </w:p>
         </w:tc>
@@ -39172,9 +38910,10 @@
           <w:p>
             <w:r>
               <w:rPr>
-                <w:sz w:val="18"/>
-              </w:rPr>
-              <w:t>PHP 6,700 to 10,300 over an 18-week plan. Travel to La Trinidad is the dominant cost.</w:t>
+                <w:b w:val="0"/>
+                <w:sz w:val="18"/>
+              </w:rPr>
+              <w:t>Python with pandas, NumPy, statsmodels, scikit-learn, and XGBoost; PostgreSQL or SQLite; a Streamlit dashboard deployed locally or on a free tier. No external API is on the critical path.</w:t>
             </w:r>
           </w:p>
         </w:tc>
@@ -39187,6 +38926,97 @@
           <w:p>
             <w:r>
               <w:rPr>
+                <w:b/>
+                <w:sz w:val="18"/>
+              </w:rPr>
+              <w:t>Algorithm or model</w:t>
+            </w:r>
+          </w:p>
+        </w:tc>
+        <w:tc>
+          <w:tcPr>
+            <w:tcW w:type="dxa" w:w="7632"/>
+          </w:tcPr>
+          <w:p>
+            <w:r>
+              <w:rPr>
+                <w:b w:val="0"/>
+                <w:sz w:val="18"/>
+              </w:rPr>
+              <w:t>XGBoost for price regression and glut-risk classification, compared against seasonal-naive, SARIMA, and random forest baselines under rolling-origin validation. Error is reported by commodity and season, with MAE, RMSE, and MAPE for price and precision, recall, F1, and PR-AUC for glut risk.</w:t>
+            </w:r>
+          </w:p>
+        </w:tc>
+      </w:tr>
+      <w:tr>
+        <w:tc>
+          <w:tcPr>
+            <w:tcW w:type="dxa" w:w="2592"/>
+          </w:tcPr>
+          <w:p>
+            <w:r>
+              <w:rPr>
+                <w:b/>
+                <w:sz w:val="18"/>
+              </w:rPr>
+              <w:t>Dataset</w:t>
+            </w:r>
+          </w:p>
+        </w:tc>
+        <w:tc>
+          <w:tcPr>
+            <w:tcW w:type="dxa" w:w="7632"/>
+          </w:tcPr>
+          <w:p>
+            <w:r>
+              <w:rPr>
+                <w:b w:val="0"/>
+                <w:sz w:val="18"/>
+              </w:rPr>
+              <w:t>BAPTC aggregate daily or weekly wholesale price and trading volume by commodity, still to be confirmed, joined with PAGASA-BSU daily rainfall and temperature. DA Bantay Presyo bulletins serve as the independent secondary series.</w:t>
+            </w:r>
+          </w:p>
+        </w:tc>
+      </w:tr>
+      <w:tr>
+        <w:tc>
+          <w:tcPr>
+            <w:tcW w:type="dxa" w:w="2592"/>
+          </w:tcPr>
+          <w:p>
+            <w:r>
+              <w:rPr>
+                <w:b/>
+                <w:sz w:val="18"/>
+              </w:rPr>
+              <w:t>Cost and completion period</w:t>
+            </w:r>
+          </w:p>
+        </w:tc>
+        <w:tc>
+          <w:tcPr>
+            <w:tcW w:type="dxa" w:w="7632"/>
+          </w:tcPr>
+          <w:p>
+            <w:r>
+              <w:rPr>
+                <w:b w:val="0"/>
+                <w:sz w:val="18"/>
+              </w:rPr>
+              <w:t>PHP 6,700 to 10,300 over an 18-week plan. Travel to La Trinidad is the dominant cost and can be reduced by using the remote request channel.</w:t>
+            </w:r>
+          </w:p>
+        </w:tc>
+      </w:tr>
+      <w:tr>
+        <w:tc>
+          <w:tcPr>
+            <w:tcW w:type="dxa" w:w="2592"/>
+          </w:tcPr>
+          <w:p>
+            <w:r>
+              <w:rPr>
+                <w:b/>
                 <w:sz w:val="18"/>
               </w:rPr>
               <w:t>Major risks and mitigation</w:t>
@@ -39200,9 +39030,10 @@
           <w:p>
             <w:r>
               <w:rPr>
-                <w:sz w:val="18"/>
-              </w:rPr>
-              <w:t>Unavailable volume data, weak forecast accuracy, and schedule delay. A Week 3 decision gate; narrowing to price-only forecasting if volume is withheld; every model compared against naive baselines; a minimum viable dashboard first.</w:t>
+                <w:b w:val="0"/>
+                <w:sz w:val="18"/>
+              </w:rPr>
+              <w:t>Unavailable or insufficient data, volume withheld while price is released, weak forecast accuracy, and schedule delay. Mitigated by the Week 3 gate, narrowing to price-only forecasting if volume is withheld, comparing every model against naive baselines, and building a minimum viable dashboard first.</w:t>
             </w:r>
           </w:p>
         </w:tc>
@@ -39215,9 +39046,10 @@
           <w:p>
             <w:r>
               <w:rPr>
-                <w:sz w:val="18"/>
-              </w:rPr>
-              <w:t>Backup title</w:t>
+                <w:b/>
+                <w:sz w:val="18"/>
+              </w:rPr>
+              <w:t>Decision gate</w:t>
             </w:r>
           </w:p>
         </w:tc>
@@ -39228,9 +39060,10 @@
           <w:p>
             <w:r>
               <w:rPr>
-                <w:sz w:val="18"/>
-              </w:rPr>
-              <w:t>Title 3: A Data Governance System for Privacy Release Readiness of Quezon City Open Data Using Mondrian k-Anonymity. The professor responded to it most strongly, the letter to ITDD was sent on September 23, 2026, and its method can be built and validated on public benchmark data while the city's reply is pending.</w:t>
+                <w:b w:val="0"/>
+                <w:sz w:val="18"/>
+              </w:rPr>
+              <w:t>Title 1 proceeds in full only if an aggregate of historical BAPTC price and trading-volume records, research-use permission, and adequate coverage are confirmed by Week 3. If price records arrive without volume, the title narrows to price forecasting and the supply-glut claim is withdrawn. If nothing is confirmed by Week 3, the group moves to Title 3.</w:t>
             </w:r>
           </w:p>
         </w:tc>
@@ -39241,19 +39074,1342 @@
         <w:spacing w:after="40"/>
       </w:pPr>
     </w:p>
-    <w:p>
-      <w:pPr>
-        <w:spacing w:after="120"/>
-        <w:jc w:val="both"/>
-      </w:pPr>
-      <w:r>
-        <w:t>Decision gate, stated plainly. Title 1 proceeds in full only if an aggregate of historical BAPTC price and trading-volume records, research-use permission, and adequate coverage are confirmed by Week 3. If price records arrive without volume, the title narrows to price forecasting and the supply-glut claim is withdrawn. If nothing is confirmed by Week 3, the group moves to Title 3.</w:t>
-      </w:r>
-    </w:p>
-    <w:p>
-      <w:r>
-        <w:br w:type="page"/>
-      </w:r>
+    <w:tbl>
+      <w:tblPr>
+        <w:tblStyle w:val="TableGrid"/>
+        <w:tblW w:type="auto" w:w="0"/>
+        <w:jc w:val="center"/>
+        <w:tblLook w:firstColumn="1" w:firstRow="1" w:lastColumn="0" w:lastRow="0" w:noHBand="0" w:noVBand="1" w:val="04A0"/>
+      </w:tblPr>
+      <w:tblGrid>
+        <w:gridCol w:w="5112"/>
+        <w:gridCol w:w="5112"/>
+      </w:tblGrid>
+      <w:tr>
+        <w:tc>
+          <w:tcPr>
+            <w:tcW w:type="dxa" w:w="2592"/>
+            <w:shd w:val="clear" w:color="auto" w:fill="EDEDED"/>
+          </w:tcPr>
+          <w:p>
+            <w:r>
+              <w:rPr>
+                <w:b/>
+                <w:sz w:val="18"/>
+              </w:rPr>
+              <w:t>Rank 2: Backup Title</w:t>
+            </w:r>
+          </w:p>
+        </w:tc>
+        <w:tc>
+          <w:tcPr>
+            <w:tcW w:type="dxa" w:w="7632"/>
+            <w:shd w:val="clear" w:color="auto" w:fill="EDEDED"/>
+          </w:tcPr>
+          <w:p>
+            <w:r>
+              <w:rPr>
+                <w:b/>
+                <w:sz w:val="18"/>
+              </w:rPr>
+              <w:t>A Data Governance System for Privacy Release Readiness of Quezon City Open Data Using Mondrian k-Anonymity</w:t>
+            </w:r>
+          </w:p>
+        </w:tc>
+      </w:tr>
+      <w:tr>
+        <w:tc>
+          <w:tcPr>
+            <w:tcW w:type="dxa" w:w="2592"/>
+          </w:tcPr>
+          <w:p>
+            <w:r>
+              <w:rPr>
+                <w:b/>
+                <w:sz w:val="18"/>
+              </w:rPr>
+              <w:t>Partner and data status</w:t>
+            </w:r>
+          </w:p>
+        </w:tc>
+        <w:tc>
+          <w:tcPr>
+            <w:tcW w:type="dxa" w:w="7632"/>
+          </w:tcPr>
+          <w:p>
+            <w:r>
+              <w:rPr>
+                <w:b w:val="0"/>
+                <w:sz w:val="18"/>
+              </w:rPr>
+              <w:t>Quezon City ITDD, which runs a documented request service, Control of Data Services in Conformity with the Data Privacy Act. The formal letter and email were sent on September 23, 2026, following an earlier request through an identified contact in the city. The reply and the shape of the record-level extract are pending.</w:t>
+            </w:r>
+          </w:p>
+        </w:tc>
+      </w:tr>
+      <w:tr>
+        <w:tc>
+          <w:tcPr>
+            <w:tcW w:type="dxa" w:w="2592"/>
+          </w:tcPr>
+          <w:p>
+            <w:r>
+              <w:rPr>
+                <w:b/>
+                <w:sz w:val="18"/>
+              </w:rPr>
+              <w:t>Why it ranks second</w:t>
+            </w:r>
+          </w:p>
+        </w:tc>
+        <w:tc>
+          <w:tcPr>
+            <w:tcW w:type="dxa" w:w="7632"/>
+          </w:tcPr>
+          <w:p>
+            <w:r>
+              <w:rPr>
+                <w:b w:val="0"/>
+                <w:sz w:val="18"/>
+              </w:rPr>
+              <w:t>It is the direction the professor responded to most strongly.</w:t>
+            </w:r>
+          </w:p>
+          <w:p>
+            <w:r>
+              <w:rPr>
+                <w:b w:val="0"/>
+                <w:sz w:val="18"/>
+              </w:rPr>
+              <w:t>It has the most robust fallback of the five titles. The method does not depend on one dataset, so it can be built and validated on public benchmark microdata while the city's reply is pending, and no development work waits on the city.</w:t>
+            </w:r>
+          </w:p>
+          <w:p>
+            <w:r>
+              <w:rPr>
+                <w:b w:val="0"/>
+                <w:sz w:val="18"/>
+              </w:rPr>
+              <w:t>It has the strongest legal grounding. Privacy is the subject of the study, not an obstacle to it, and the National Privacy Commission guidance that governs it has already been identified.</w:t>
+            </w:r>
+          </w:p>
+          <w:p>
+            <w:r>
+              <w:rPr>
+                <w:b w:val="0"/>
+                <w:sz w:val="18"/>
+              </w:rPr>
+              <w:t>It ranks below Title 1 because the group is committed to Title 1, and because this title's contribution still depends on a record-level extract whose shape is unconfirmed. As the backup, it is the title the group can switch to at the Week 3 gate without losing time.</w:t>
+            </w:r>
+          </w:p>
+        </w:tc>
+      </w:tr>
+      <w:tr>
+        <w:tc>
+          <w:tcPr>
+            <w:tcW w:type="dxa" w:w="2592"/>
+          </w:tcPr>
+          <w:p>
+            <w:r>
+              <w:rPr>
+                <w:b/>
+                <w:sz w:val="18"/>
+              </w:rPr>
+              <w:t>What the RRL establishes</w:t>
+            </w:r>
+          </w:p>
+        </w:tc>
+        <w:tc>
+          <w:tcPr>
+            <w:tcW w:type="dxa" w:w="7632"/>
+          </w:tcPr>
+          <w:p>
+            <w:r>
+              <w:rPr>
+                <w:b w:val="0"/>
+                <w:sz w:val="18"/>
+              </w:rPr>
+              <w:t>Local literature. Republic Act No. 10173 makes any record-level city dataset personal information until shown otherwise. Executive Order No. 2, s. 2016 requires government to disclose while protecting privacy, which is the tension the system resolves. NPC Advisory No. 2025-02 supports building privacy checks into the release process itself. The QC Open Data Dashboard confirms the partner, the candidate datasets, and that more releases are planned. The national portal, data.gov.ph, listed 175 datasets from 17 agencies and no local government publishers when the group checked it on September 19 and September 24, 2026.</w:t>
+            </w:r>
+          </w:p>
+          <w:p>
+            <w:r>
+              <w:rPr>
+                <w:b w:val="0"/>
+                <w:sz w:val="18"/>
+              </w:rPr>
+              <w:t>Foreign literature. Sweeney (2002) showed that records without names can still be re-identified, and defined k-anonymity. LeFevre, DeWitt, and Ramakrishnan (2006) proposed Mondrian, which keeps more detail than single-dimension methods at the same k. Machanavajjhala et al. (2007) define the known weakness of k-anonymity, which the study reports as a limitation. Wang and Strong (1996) and Janssen, Charalabidis, and Zuiderwijk (2012) show that data quality is multi-dimensional, and that privacy and quality concerns are documented reasons governments hold back data.</w:t>
+            </w:r>
+          </w:p>
+        </w:tc>
+      </w:tr>
+      <w:tr>
+        <w:tc>
+          <w:tcPr>
+            <w:tcW w:type="dxa" w:w="2592"/>
+          </w:tcPr>
+          <w:p>
+            <w:r>
+              <w:rPr>
+                <w:b/>
+                <w:sz w:val="18"/>
+              </w:rPr>
+              <w:t>What the RRS establishes</w:t>
+            </w:r>
+          </w:p>
+        </w:tc>
+        <w:tc>
+          <w:tcPr>
+            <w:tcW w:type="dxa" w:w="7632"/>
+          </w:tcPr>
+          <w:p>
+            <w:r>
+              <w:rPr>
+                <w:b w:val="0"/>
+                <w:sz w:val="18"/>
+              </w:rPr>
+              <w:t>Local studies. Perez (2025) analysed over 235,000 eFOI requests and found that about 44 percent contained personal information, even with privacy advisories in place. Perez (2020) found that agencies process requests inconsistently. Alampay (2021) and Pacis (2017) document the state of Philippine open data and the capacity barriers among government staff, and Pitogo (2019) found a national agency only partially compliant with the Data Privacy Act.</w:t>
+            </w:r>
+          </w:p>
+          <w:p>
+            <w:r>
+              <w:rPr>
+                <w:b w:val="0"/>
+                <w:sz w:val="18"/>
+              </w:rPr>
+              <w:t>Foreign studies. Rocher, Hendrickx, and de Montjoye (2019) estimated that 99.98 percent of Americans could be re-identified from 15 demographic attributes, and de Montjoye et al. (2013) identified 95 percent of 1.5 million people from four location and time points. El Emam et al. (2009) showed that the choice of k-anonymity algorithm changes how much detail survives. Vetrò et al. (2016) found that municipal releases without quality controls were measurably weaker. Prasser et al. (2020) describe ARX, which the group uses to cross-check its Mondrian output.</w:t>
+            </w:r>
+          </w:p>
+        </w:tc>
+      </w:tr>
+      <w:tr>
+        <w:tc>
+          <w:tcPr>
+            <w:tcW w:type="dxa" w:w="2592"/>
+          </w:tcPr>
+          <w:p>
+            <w:r>
+              <w:rPr>
+                <w:b/>
+                <w:sz w:val="18"/>
+              </w:rPr>
+              <w:t>Research gap it fills</w:t>
+            </w:r>
+          </w:p>
+        </w:tc>
+        <w:tc>
+          <w:tcPr>
+            <w:tcW w:type="dxa" w:w="7632"/>
+          </w:tcPr>
+          <w:p>
+            <w:r>
+              <w:rPr>
+                <w:b w:val="0"/>
+                <w:sz w:val="18"/>
+              </w:rPr>
+              <w:t>No published work applies these risk and quality measurements to a Philippine local government open-data release, and no Philippine study compares a smarter anonymisation method against the blanket suppression data owners actually use. The study delivers an auditable, reusable release-readiness procedure.</w:t>
+            </w:r>
+          </w:p>
+        </w:tc>
+      </w:tr>
+      <w:tr>
+        <w:tc>
+          <w:tcPr>
+            <w:tcW w:type="dxa" w:w="2592"/>
+          </w:tcPr>
+          <w:p>
+            <w:r>
+              <w:rPr>
+                <w:b/>
+                <w:sz w:val="18"/>
+              </w:rPr>
+              <w:t>Method, cost, and period</w:t>
+            </w:r>
+          </w:p>
+        </w:tc>
+        <w:tc>
+          <w:tcPr>
+            <w:tcW w:type="dxa" w:w="7632"/>
+          </w:tcPr>
+          <w:p>
+            <w:r>
+              <w:rPr>
+                <w:b w:val="0"/>
+                <w:sz w:val="18"/>
+              </w:rPr>
+              <w:t>Mondrian k-anonymity against fixed small-cell suppression as the baseline, with k reported across several values and ARX as a cross-check. An open-source Python stack. PHP 3,900 to 4,500 over 18 weeks, with travel as the only material cost.</w:t>
+            </w:r>
+          </w:p>
+        </w:tc>
+      </w:tr>
+      <w:tr>
+        <w:tc>
+          <w:tcPr>
+            <w:tcW w:type="dxa" w:w="2592"/>
+          </w:tcPr>
+          <w:p>
+            <w:r>
+              <w:rPr>
+                <w:b/>
+                <w:sz w:val="18"/>
+              </w:rPr>
+              <w:t>Condition for moving to it</w:t>
+            </w:r>
+          </w:p>
+        </w:tc>
+        <w:tc>
+          <w:tcPr>
+            <w:tcW w:type="dxa" w:w="7632"/>
+          </w:tcPr>
+          <w:p>
+            <w:r>
+              <w:rPr>
+                <w:b w:val="0"/>
+                <w:sz w:val="18"/>
+              </w:rPr>
+              <w:t>The group moves to Title 3 if Title 1's data conditions are not met by Week 3.</w:t>
+            </w:r>
+          </w:p>
+        </w:tc>
+      </w:tr>
+    </w:tbl>
+    <w:p>
+      <w:pPr>
+        <w:spacing w:after="40"/>
+      </w:pPr>
+    </w:p>
+    <w:tbl>
+      <w:tblPr>
+        <w:tblStyle w:val="TableGrid"/>
+        <w:tblW w:type="auto" w:w="0"/>
+        <w:jc w:val="center"/>
+        <w:tblLook w:firstColumn="1" w:firstRow="1" w:lastColumn="0" w:lastRow="0" w:noHBand="0" w:noVBand="1" w:val="04A0"/>
+      </w:tblPr>
+      <w:tblGrid>
+        <w:gridCol w:w="5112"/>
+        <w:gridCol w:w="5112"/>
+      </w:tblGrid>
+      <w:tr>
+        <w:tc>
+          <w:tcPr>
+            <w:tcW w:type="dxa" w:w="2592"/>
+            <w:shd w:val="clear" w:color="auto" w:fill="EDEDED"/>
+          </w:tcPr>
+          <w:p>
+            <w:r>
+              <w:rPr>
+                <w:b/>
+                <w:sz w:val="18"/>
+              </w:rPr>
+              <w:t>Rank 3: Second Alternative</w:t>
+            </w:r>
+          </w:p>
+        </w:tc>
+        <w:tc>
+          <w:tcPr>
+            <w:tcW w:type="dxa" w:w="7632"/>
+            <w:shd w:val="clear" w:color="auto" w:fill="EDEDED"/>
+          </w:tcPr>
+          <w:p>
+            <w:r>
+              <w:rPr>
+                <w:b/>
+                <w:sz w:val="18"/>
+              </w:rPr>
+              <w:t>Demand Forecasting and Dynamic Price Optimization for Milk Retail Products Considering Remaining Shelf Life Using XGBoost</w:t>
+            </w:r>
+          </w:p>
+        </w:tc>
+      </w:tr>
+      <w:tr>
+        <w:tc>
+          <w:tcPr>
+            <w:tcW w:type="dxa" w:w="2592"/>
+          </w:tcPr>
+          <w:p>
+            <w:r>
+              <w:rPr>
+                <w:b/>
+                <w:sz w:val="18"/>
+              </w:rPr>
+              <w:t>Partner and data status</w:t>
+            </w:r>
+          </w:p>
+        </w:tc>
+        <w:tc>
+          <w:tcPr>
+            <w:tcW w:type="dxa" w:w="7632"/>
+          </w:tcPr>
+          <w:p>
+            <w:r>
+              <w:rPr>
+                <w:b w:val="0"/>
+                <w:sz w:val="18"/>
+              </w:rPr>
+              <w:t>A partner retailer is still to be confirmed. The group is more certain of securing a retailer and its sales data for this title than for the partner-dependent titles below it, and public retail datasets are a fallback.</w:t>
+            </w:r>
+          </w:p>
+        </w:tc>
+      </w:tr>
+      <w:tr>
+        <w:tc>
+          <w:tcPr>
+            <w:tcW w:type="dxa" w:w="2592"/>
+          </w:tcPr>
+          <w:p>
+            <w:r>
+              <w:rPr>
+                <w:b/>
+                <w:sz w:val="18"/>
+              </w:rPr>
+              <w:t>Why it ranks third</w:t>
+            </w:r>
+          </w:p>
+        </w:tc>
+        <w:tc>
+          <w:tcPr>
+            <w:tcW w:type="dxa" w:w="7632"/>
+          </w:tcPr>
+          <w:p>
+            <w:r>
+              <w:rPr>
+                <w:b w:val="0"/>
+                <w:sz w:val="18"/>
+              </w:rPr>
+              <w:t>The group is more certain that it can secure both a dataset and a client for this title.</w:t>
+            </w:r>
+          </w:p>
+          <w:p>
+            <w:r>
+              <w:rPr>
+                <w:b w:val="0"/>
+                <w:sz w:val="18"/>
+              </w:rPr>
+              <w:t>It does not depend on a government office or foundation agreeing to release records, which is the risk that weighs on Titles 1, 2, and 3.</w:t>
+            </w:r>
+          </w:p>
+          <w:p>
+            <w:r>
+              <w:rPr>
+                <w:b w:val="0"/>
+                <w:sz w:val="18"/>
+              </w:rPr>
+              <w:t>It is the least expensive title, at PHP 1,000 to 4,000, and it involves no personal customer data.</w:t>
+            </w:r>
+          </w:p>
+          <w:p>
+            <w:r>
+              <w:rPr>
+                <w:b w:val="0"/>
+                <w:sz w:val="18"/>
+              </w:rPr>
+              <w:t>It ranks below Titles 1 and 3 because the group is committed to Title 1 and the professor favoured Title 3, and because its partner store is not yet confirmed and its price-optimization results depend on the store's prices having varied enough in the past.</w:t>
+            </w:r>
+          </w:p>
+        </w:tc>
+      </w:tr>
+      <w:tr>
+        <w:tc>
+          <w:tcPr>
+            <w:tcW w:type="dxa" w:w="2592"/>
+          </w:tcPr>
+          <w:p>
+            <w:r>
+              <w:rPr>
+                <w:b/>
+                <w:sz w:val="18"/>
+              </w:rPr>
+              <w:t>What the RRL establishes</w:t>
+            </w:r>
+          </w:p>
+        </w:tc>
+        <w:tc>
+          <w:tcPr>
+            <w:tcW w:type="dxa" w:w="7632"/>
+          </w:tcPr>
+          <w:p>
+            <w:r>
+              <w:rPr>
+                <w:b w:val="0"/>
+                <w:sz w:val="18"/>
+              </w:rPr>
+              <w:t>Local literature. The U.S. Department of Agriculture Foreign Agricultural Service (2024) reports that the Philippines imports about 99 percent of its dairy requirement, that local production supplies only about 20 percent of ready-to-drink milk, and that demand for it is forecast to grow. Milk is therefore a steady retail category made up largely of imported stock with a limited shelf life. Barrion et al. (2023) confirm that food waste is a recognised Philippine problem and that managing stock by age is an accepted way to reduce it.</w:t>
+            </w:r>
+          </w:p>
+          <w:p>
+            <w:r>
+              <w:rPr>
+                <w:b w:val="0"/>
+                <w:sz w:val="18"/>
+              </w:rPr>
+              <w:t>Foreign literature. Keskin, Li, and Song (2022) show that retailers do not fully know how demand responds to price or how fast stock perishes, and that this relationship changes over time. Syed et al. (2024) stress reliable data and continuous adjustment in perishable pricing. Yavuz and Kaya (2024) show that shelf life makes pricing and inventory decisions harder. Tekin and Erol (2017) argue that much perishable waste comes from pricing that ignores product age, which directly supports pricing by remaining shelf life.</w:t>
+            </w:r>
+          </w:p>
+        </w:tc>
+      </w:tr>
+      <w:tr>
+        <w:tc>
+          <w:tcPr>
+            <w:tcW w:type="dxa" w:w="2592"/>
+          </w:tcPr>
+          <w:p>
+            <w:r>
+              <w:rPr>
+                <w:b/>
+                <w:sz w:val="18"/>
+              </w:rPr>
+              <w:t>What the RRS establishes</w:t>
+            </w:r>
+          </w:p>
+        </w:tc>
+        <w:tc>
+          <w:tcPr>
+            <w:tcW w:type="dxa" w:w="7632"/>
+          </w:tcPr>
+          <w:p>
+            <w:r>
+              <w:rPr>
+                <w:b w:val="0"/>
+                <w:sz w:val="18"/>
+              </w:rPr>
+              <w:t>Foreign studies. Syed et al. (2024) developed a three-phase framework for dynamic pricing of perishables in supermarkets. Keskin, Li, and Song (2022) used a major supermarket chain's data and accounted for age-dependent perishability. Yavuz and Kaya (2024) used deep reinforcement learning, which the study replaces with more accessible supervised models. Massaro et al. (2021) applied XGBoost to retail sales forecasting and handled short data with augmentation. Ferreira, Lee, and Simchi-Levi (2016) turned demand forecasts into daily pricing decisions, which is the two-stage design this study uses.</w:t>
+            </w:r>
+          </w:p>
+          <w:p>
+            <w:r>
+              <w:rPr>
+                <w:b w:val="0"/>
+                <w:sz w:val="18"/>
+              </w:rPr>
+              <w:t>Local studies. No Philippine study on demand forecasting or dynamic pricing for milk retail was found, which is part of the gap.</w:t>
+            </w:r>
+          </w:p>
+        </w:tc>
+      </w:tr>
+      <w:tr>
+        <w:tc>
+          <w:tcPr>
+            <w:tcW w:type="dxa" w:w="2592"/>
+          </w:tcPr>
+          <w:p>
+            <w:r>
+              <w:rPr>
+                <w:b/>
+                <w:sz w:val="18"/>
+              </w:rPr>
+              <w:t>Research gap it fills</w:t>
+            </w:r>
+          </w:p>
+        </w:tc>
+        <w:tc>
+          <w:tcPr>
+            <w:tcW w:type="dxa" w:w="7632"/>
+          </w:tcPr>
+          <w:p>
+            <w:r>
+              <w:rPr>
+                <w:b w:val="0"/>
+                <w:sz w:val="18"/>
+              </w:rPr>
+              <w:t>The reviewed work comes from large foreign retailers and uses methods that are complex to deploy. It does not give Philippine small and medium retailers an accessible tool that forecasts milk demand with supervised models and turns remaining shelf life into a pricing recommendation.</w:t>
+            </w:r>
+          </w:p>
+        </w:tc>
+      </w:tr>
+      <w:tr>
+        <w:tc>
+          <w:tcPr>
+            <w:tcW w:type="dxa" w:w="2592"/>
+          </w:tcPr>
+          <w:p>
+            <w:r>
+              <w:rPr>
+                <w:b/>
+                <w:sz w:val="18"/>
+              </w:rPr>
+              <w:t>Method, cost, and period</w:t>
+            </w:r>
+          </w:p>
+        </w:tc>
+        <w:tc>
+          <w:tcPr>
+            <w:tcW w:type="dxa" w:w="7632"/>
+          </w:tcPr>
+          <w:p>
+            <w:r>
+              <w:rPr>
+                <w:b w:val="0"/>
+                <w:sz w:val="18"/>
+              </w:rPr>
+              <w:t>Linear Regression as the baseline against Random Forest and XGBoost, evaluated with MAE, RMSE, and MAPE. The selected model feeds a price optimization step that weighs predicted demand, cost, inventory, and remaining shelf life. PHP 1,000 to 4,000 over a 16-week plan.</w:t>
+            </w:r>
+          </w:p>
+        </w:tc>
+      </w:tr>
+      <w:tr>
+        <w:tc>
+          <w:tcPr>
+            <w:tcW w:type="dxa" w:w="2592"/>
+          </w:tcPr>
+          <w:p>
+            <w:r>
+              <w:rPr>
+                <w:b/>
+                <w:sz w:val="18"/>
+              </w:rPr>
+              <w:t>Condition for moving to it</w:t>
+            </w:r>
+          </w:p>
+        </w:tc>
+        <w:tc>
+          <w:tcPr>
+            <w:tcW w:type="dxa" w:w="7632"/>
+          </w:tcPr>
+          <w:p>
+            <w:r>
+              <w:rPr>
+                <w:b w:val="0"/>
+                <w:sz w:val="18"/>
+              </w:rPr>
+              <w:t>The group moves to Title 5 if neither Title 1 nor Title 3 can proceed.</w:t>
+            </w:r>
+          </w:p>
+        </w:tc>
+      </w:tr>
+    </w:tbl>
+    <w:p>
+      <w:pPr>
+        <w:spacing w:after="40"/>
+      </w:pPr>
+    </w:p>
+    <w:tbl>
+      <w:tblPr>
+        <w:tblStyle w:val="TableGrid"/>
+        <w:tblW w:type="auto" w:w="0"/>
+        <w:jc w:val="center"/>
+        <w:tblLook w:firstColumn="1" w:firstRow="1" w:lastColumn="0" w:lastRow="0" w:noHBand="0" w:noVBand="1" w:val="04A0"/>
+      </w:tblPr>
+      <w:tblGrid>
+        <w:gridCol w:w="5112"/>
+        <w:gridCol w:w="5112"/>
+      </w:tblGrid>
+      <w:tr>
+        <w:tc>
+          <w:tcPr>
+            <w:tcW w:type="dxa" w:w="2592"/>
+            <w:shd w:val="clear" w:color="auto" w:fill="EDEDED"/>
+          </w:tcPr>
+          <w:p>
+            <w:r>
+              <w:rPr>
+                <w:b/>
+                <w:sz w:val="18"/>
+              </w:rPr>
+              <w:t>Rank 4: Third Alternative</w:t>
+            </w:r>
+          </w:p>
+        </w:tc>
+        <w:tc>
+          <w:tcPr>
+            <w:tcW w:type="dxa" w:w="7632"/>
+            <w:shd w:val="clear" w:color="auto" w:fill="EDEDED"/>
+          </w:tcPr>
+          <w:p>
+            <w:r>
+              <w:rPr>
+                <w:b/>
+                <w:sz w:val="18"/>
+              </w:rPr>
+              <w:t>A Data Governance System for Verifiable CSR Impact Reporting Using Fellegi-Sunter Record Linkage</w:t>
+            </w:r>
+          </w:p>
+        </w:tc>
+      </w:tr>
+      <w:tr>
+        <w:tc>
+          <w:tcPr>
+            <w:tcW w:type="dxa" w:w="2592"/>
+          </w:tcPr>
+          <w:p>
+            <w:r>
+              <w:rPr>
+                <w:b/>
+                <w:sz w:val="18"/>
+              </w:rPr>
+              <w:t>Partner and data status</w:t>
+            </w:r>
+          </w:p>
+        </w:tc>
+        <w:tc>
+          <w:tcPr>
+            <w:tcW w:type="dxa" w:w="7632"/>
+          </w:tcPr>
+          <w:p>
+            <w:r>
+              <w:rPr>
+                <w:b w:val="0"/>
+                <w:sz w:val="18"/>
+              </w:rPr>
+              <w:t>SM Foundation. Dawn raised the partnership in person on September 21, 2026, the Foundation invited the proposal, and the letter was sent on September 23, 2026. Whether the Kabalikat sa Kabuhayan records are digital, whether names can be hashed on the Foundation's side, and whether a reviewed sample can be built are all unconfirmed.</w:t>
+            </w:r>
+          </w:p>
+        </w:tc>
+      </w:tr>
+      <w:tr>
+        <w:tc>
+          <w:tcPr>
+            <w:tcW w:type="dxa" w:w="2592"/>
+          </w:tcPr>
+          <w:p>
+            <w:r>
+              <w:rPr>
+                <w:b/>
+                <w:sz w:val="18"/>
+              </w:rPr>
+              <w:t>Why it ranks fourth</w:t>
+            </w:r>
+          </w:p>
+        </w:tc>
+        <w:tc>
+          <w:tcPr>
+            <w:tcW w:type="dxa" w:w="7632"/>
+          </w:tcPr>
+          <w:p>
+            <w:r>
+              <w:rPr>
+                <w:b w:val="0"/>
+                <w:sz w:val="18"/>
+              </w:rPr>
+              <w:t>The group has a closer contact at SM Foundation than at any other partner, so reaching the client is easier than for most titles.</w:t>
+            </w:r>
+          </w:p>
+          <w:p>
+            <w:r>
+              <w:rPr>
+                <w:b w:val="0"/>
+                <w:sz w:val="18"/>
+              </w:rPr>
+              <w:t>The partnership is still uncertain, however, and the record format and ground truth that decide the title are unconfirmed.</w:t>
+            </w:r>
+          </w:p>
+          <w:p>
+            <w:r>
+              <w:rPr>
+                <w:b w:val="0"/>
+                <w:sz w:val="18"/>
+              </w:rPr>
+              <w:t>It ranks above Title 4 because its data is less sensitive than child health records, the Foundation is both the data owner and the user, and an Exempt ethics route is achievable because the group never holds identifiable records.</w:t>
+            </w:r>
+          </w:p>
+        </w:tc>
+      </w:tr>
+      <w:tr>
+        <w:tc>
+          <w:tcPr>
+            <w:tcW w:type="dxa" w:w="2592"/>
+          </w:tcPr>
+          <w:p>
+            <w:r>
+              <w:rPr>
+                <w:b/>
+                <w:sz w:val="18"/>
+              </w:rPr>
+              <w:t>What the RRL establishes</w:t>
+            </w:r>
+          </w:p>
+        </w:tc>
+        <w:tc>
+          <w:tcPr>
+            <w:tcW w:type="dxa" w:w="7632"/>
+          </w:tcPr>
+          <w:p>
+            <w:r>
+              <w:rPr>
+                <w:b w:val="0"/>
+                <w:sz w:val="18"/>
+              </w:rPr>
+              <w:t>Local literature. Republic Act No. 11055 shows that the lack of a common identifier across records is a recognised Philippine problem, and explains why the study builds links from fields the Foundation already keeps rather than requesting PhilSys numbers.</w:t>
+            </w:r>
+          </w:p>
+          <w:p>
+            <w:r>
+              <w:rPr>
+                <w:b w:val="0"/>
+                <w:sz w:val="18"/>
+              </w:rPr>
+              <w:t>Foreign literature. Fellegi and Sunter (1969) give record linkage its decision-theoretic basis, which lets the system attach chosen error rates to the beneficiary count. Christen and Goiser (2007) supply the evaluation measures. Binette and Steorts (2022) frame the pipeline of blocking, comparison, and classification. Harron et al. (2017) argue that linkage quality must be reported alongside the result.</w:t>
+            </w:r>
+          </w:p>
+        </w:tc>
+      </w:tr>
+      <w:tr>
+        <w:tc>
+          <w:tcPr>
+            <w:tcW w:type="dxa" w:w="2592"/>
+          </w:tcPr>
+          <w:p>
+            <w:r>
+              <w:rPr>
+                <w:b/>
+                <w:sz w:val="18"/>
+              </w:rPr>
+              <w:t>What the RRS establishes</w:t>
+            </w:r>
+          </w:p>
+        </w:tc>
+        <w:tc>
+          <w:tcPr>
+            <w:tcW w:type="dxa" w:w="7632"/>
+          </w:tcPr>
+          <w:p>
+            <w:r>
+              <w:rPr>
+                <w:b w:val="0"/>
+                <w:sz w:val="18"/>
+              </w:rPr>
+              <w:t>Local studies. Du (2026), writing from the Philippine Statistics Authority, identifies duplicate records as a persistent national data quality problem. Zuniga et al. (2026) describe a Philippine health information exchange that needed a single identity record to deduplicate patients across facilities.</w:t>
+            </w:r>
+          </w:p>
+          <w:p>
+            <w:r>
+              <w:rPr>
+                <w:b w:val="0"/>
+                <w:sz w:val="18"/>
+              </w:rPr>
+              <w:t>Foreign studies. Enamorado, Fifield, and Imai (2019) show Fellegi-Sunter working on millions of records through fastLink. Li, Xu, and Grannis (2022) give a tested way to handle missing fields. Hand and Christen (2018) are the reason precision and recall are reported separately.</w:t>
+            </w:r>
+          </w:p>
+        </w:tc>
+      </w:tr>
+      <w:tr>
+        <w:tc>
+          <w:tcPr>
+            <w:tcW w:type="dxa" w:w="2592"/>
+          </w:tcPr>
+          <w:p>
+            <w:r>
+              <w:rPr>
+                <w:b/>
+                <w:sz w:val="18"/>
+              </w:rPr>
+              <w:t>Research gap it fills</w:t>
+            </w:r>
+          </w:p>
+        </w:tc>
+        <w:tc>
+          <w:tcPr>
+            <w:tcW w:type="dxa" w:w="7632"/>
+          </w:tcPr>
+          <w:p>
+            <w:r>
+              <w:rPr>
+                <w:b w:val="0"/>
+                <w:sz w:val="18"/>
+              </w:rPr>
+              <w:t>No published study applies probabilistic linkage to a Philippine corporate or NGO livelihood programme where no shared identifier exists, or measures linkage performance on Philippine name conventions. The Foundation's own published totals disagree, at 28,550, over 30,000, and over 32,000 graduates, which shows the problem is real.</w:t>
+            </w:r>
+          </w:p>
+        </w:tc>
+      </w:tr>
+      <w:tr>
+        <w:tc>
+          <w:tcPr>
+            <w:tcW w:type="dxa" w:w="2592"/>
+          </w:tcPr>
+          <w:p>
+            <w:r>
+              <w:rPr>
+                <w:b/>
+                <w:sz w:val="18"/>
+              </w:rPr>
+              <w:t>Method, cost, and period</w:t>
+            </w:r>
+          </w:p>
+        </w:tc>
+        <w:tc>
+          <w:tcPr>
+            <w:tcW w:type="dxa" w:w="7632"/>
+          </w:tcPr>
+          <w:p>
+            <w:r>
+              <w:rPr>
+                <w:b w:val="0"/>
+                <w:sz w:val="18"/>
+              </w:rPr>
+              <w:t>Fellegi-Sunter as the primary model, with exact matching and a Jaro-Winkler threshold as baselines. PHP 2,000 to 4,000 over 18 weeks, since the Foundation is in Metro Manila.</w:t>
+            </w:r>
+          </w:p>
+        </w:tc>
+      </w:tr>
+      <w:tr>
+        <w:tc>
+          <w:tcPr>
+            <w:tcW w:type="dxa" w:w="2592"/>
+          </w:tcPr>
+          <w:p>
+            <w:r>
+              <w:rPr>
+                <w:b/>
+                <w:sz w:val="18"/>
+              </w:rPr>
+              <w:t>Condition for moving to it</w:t>
+            </w:r>
+          </w:p>
+        </w:tc>
+        <w:tc>
+          <w:tcPr>
+            <w:tcW w:type="dxa" w:w="7632"/>
+          </w:tcPr>
+          <w:p>
+            <w:r>
+              <w:rPr>
+                <w:b w:val="0"/>
+                <w:sz w:val="18"/>
+              </w:rPr>
+              <w:t>The group moves to Title 2 if Titles 1, 3, and 5 cannot proceed and the Foundation confirms digital records and a reviewed sample.</w:t>
+            </w:r>
+          </w:p>
+        </w:tc>
+      </w:tr>
+    </w:tbl>
+    <w:p>
+      <w:pPr>
+        <w:spacing w:after="40"/>
+      </w:pPr>
+    </w:p>
+    <w:tbl>
+      <w:tblPr>
+        <w:tblStyle w:val="TableGrid"/>
+        <w:tblW w:type="auto" w:w="0"/>
+        <w:jc w:val="center"/>
+        <w:tblLook w:firstColumn="1" w:firstRow="1" w:lastColumn="0" w:lastRow="0" w:noHBand="0" w:noVBand="1" w:val="04A0"/>
+      </w:tblPr>
+      <w:tblGrid>
+        <w:gridCol w:w="5112"/>
+        <w:gridCol w:w="5112"/>
+      </w:tblGrid>
+      <w:tr>
+        <w:tc>
+          <w:tcPr>
+            <w:tcW w:type="dxa" w:w="2592"/>
+            <w:shd w:val="clear" w:color="auto" w:fill="EDEDED"/>
+          </w:tcPr>
+          <w:p>
+            <w:r>
+              <w:rPr>
+                <w:b/>
+                <w:sz w:val="18"/>
+              </w:rPr>
+              <w:t>Rank 5: Fourth Alternative</w:t>
+            </w:r>
+          </w:p>
+        </w:tc>
+        <w:tc>
+          <w:tcPr>
+            <w:tcW w:type="dxa" w:w="7632"/>
+            <w:shd w:val="clear" w:color="auto" w:fill="EDEDED"/>
+          </w:tcPr>
+          <w:p>
+            <w:r>
+              <w:rPr>
+                <w:b/>
+                <w:sz w:val="18"/>
+              </w:rPr>
+              <w:t>Development of a Fuzzy Matching and Data Quality Scoring Model for Detecting Potential Duplicate and Incomplete Child Immunization Records at a Barangay Health Center in Mandaluyong City</w:t>
+            </w:r>
+          </w:p>
+        </w:tc>
+      </w:tr>
+      <w:tr>
+        <w:tc>
+          <w:tcPr>
+            <w:tcW w:type="dxa" w:w="2592"/>
+          </w:tcPr>
+          <w:p>
+            <w:r>
+              <w:rPr>
+                <w:b/>
+                <w:sz w:val="18"/>
+              </w:rPr>
+              <w:t>Partner and data status</w:t>
+            </w:r>
+          </w:p>
+        </w:tc>
+        <w:tc>
+          <w:tcPr>
+            <w:tcW w:type="dxa" w:w="7632"/>
+          </w:tcPr>
+          <w:p>
+            <w:r>
+              <w:rPr>
+                <w:b w:val="0"/>
+                <w:sz w:val="18"/>
+              </w:rPr>
+              <w:t>A barangay health center in Mandaluyong City. The specific health center is still being identified, so no request has been sent yet.</w:t>
+            </w:r>
+          </w:p>
+        </w:tc>
+      </w:tr>
+      <w:tr>
+        <w:tc>
+          <w:tcPr>
+            <w:tcW w:type="dxa" w:w="2592"/>
+          </w:tcPr>
+          <w:p>
+            <w:r>
+              <w:rPr>
+                <w:b/>
+                <w:sz w:val="18"/>
+              </w:rPr>
+              <w:t>Why it ranks fifth</w:t>
+            </w:r>
+          </w:p>
+        </w:tc>
+        <w:tc>
+          <w:tcPr>
+            <w:tcW w:type="dxa" w:w="7632"/>
+          </w:tcPr>
+          <w:p>
+            <w:r>
+              <w:rPr>
+                <w:b w:val="0"/>
+                <w:sz w:val="18"/>
+              </w:rPr>
+              <w:t>Child immunization records are health data, which in the Philippines are highly confidential and among the hardest records to obtain. The title's own RRL confirms this: Republic Act No. 10173 and its Implementing Rules and Regulations require restricted, lawful handling of these records and organisational, physical, and technical safeguards.</w:t>
+            </w:r>
+          </w:p>
+          <w:p>
+            <w:r>
+              <w:rPr>
+                <w:b w:val="0"/>
+                <w:sz w:val="18"/>
+              </w:rPr>
+              <w:t>The group is still looking for a partner health center, and reaching 10,000 records from a single center is itself difficult. Whether simulated records may count toward that floor is still to be confirmed with the professor.</w:t>
+            </w:r>
+          </w:p>
+          <w:p>
+            <w:r>
+              <w:rPr>
+                <w:b w:val="0"/>
+                <w:sz w:val="18"/>
+              </w:rPr>
+              <w:t>It ranks below Title 2 because its data is far more sensitive and its client has not yet been found, while SM Foundation has already invited a proposal.</w:t>
+            </w:r>
+          </w:p>
+        </w:tc>
+      </w:tr>
+      <w:tr>
+        <w:tc>
+          <w:tcPr>
+            <w:tcW w:type="dxa" w:w="2592"/>
+          </w:tcPr>
+          <w:p>
+            <w:r>
+              <w:rPr>
+                <w:b/>
+                <w:sz w:val="18"/>
+              </w:rPr>
+              <w:t>What the RRL establishes</w:t>
+            </w:r>
+          </w:p>
+        </w:tc>
+        <w:tc>
+          <w:tcPr>
+            <w:tcW w:type="dxa" w:w="7632"/>
+          </w:tcPr>
+          <w:p>
+            <w:r>
+              <w:rPr>
+                <w:b w:val="0"/>
+                <w:sz w:val="18"/>
+              </w:rPr>
+              <w:t>Local literature. Republic Act No. 10173 and its Implementing Rules and Regulations set the safeguards for child health data. The Universal Health Care Act and the Philippine eHealth Strategic Framework establish why reliable immunization information matters for service continuity and local reporting.</w:t>
+            </w:r>
+          </w:p>
+          <w:p>
+            <w:r>
+              <w:rPr>
+                <w:b w:val="0"/>
+                <w:sz w:val="18"/>
+              </w:rPr>
+              <w:t>Foreign literature. The WHO Immunization Agenda 2030 stresses using good information to find missed children. The WHO Data Quality Review Toolkit, Weiskopf and Weng (2013), and Kahn et al. (2016) define the completeness, consistency, and plausibility checks that become the tool's validation rules.</w:t>
+            </w:r>
+          </w:p>
+        </w:tc>
+      </w:tr>
+      <w:tr>
+        <w:tc>
+          <w:tcPr>
+            <w:tcW w:type="dxa" w:w="2592"/>
+          </w:tcPr>
+          <w:p>
+            <w:r>
+              <w:rPr>
+                <w:b/>
+                <w:sz w:val="18"/>
+              </w:rPr>
+              <w:t>What the RRS establishes</w:t>
+            </w:r>
+          </w:p>
+        </w:tc>
+        <w:tc>
+          <w:tcPr>
+            <w:tcW w:type="dxa" w:w="7632"/>
+          </w:tcPr>
+          <w:p>
+            <w:r>
+              <w:rPr>
+                <w:b w:val="0"/>
+                <w:sz w:val="18"/>
+              </w:rPr>
+              <w:t>Local studies. Acacio Claro et al. (2024) found that installing a system does not ensure consistently entered records. Conjares et al. (2025) document fragmented data management in Philippine health information systems. Elepano et al. (2025) found that privacy design and workflow fit decide whether primary care staff accept electronic records.</w:t>
+            </w:r>
+          </w:p>
+          <w:p>
+            <w:r>
+              <w:rPr>
+                <w:b w:val="0"/>
+                <w:sz w:val="18"/>
+              </w:rPr>
+              <w:t>Foreign studies. Sweeney et al. (2013) support fuzzy matching to flag possible duplicates rather than merge them automatically. Lewis et al. (2023) found no single standard method for assessing health record quality, and Jin et al. (2023) found missing, inconsistent, and duplicated data to be recurring problems.</w:t>
+            </w:r>
+          </w:p>
+        </w:tc>
+      </w:tr>
+      <w:tr>
+        <w:tc>
+          <w:tcPr>
+            <w:tcW w:type="dxa" w:w="2592"/>
+          </w:tcPr>
+          <w:p>
+            <w:r>
+              <w:rPr>
+                <w:b/>
+                <w:sz w:val="18"/>
+              </w:rPr>
+              <w:t>Research gap it fills</w:t>
+            </w:r>
+          </w:p>
+        </w:tc>
+        <w:tc>
+          <w:tcPr>
+            <w:tcW w:type="dxa" w:w="7632"/>
+          </w:tcPr>
+          <w:p>
+            <w:r>
+              <w:rPr>
+                <w:b w:val="0"/>
+                <w:sz w:val="18"/>
+              </w:rPr>
+              <w:t>The reviewed frameworks explain good data quality and immunization monitoring, but do not give a small Philippine barangay health center an explainable tool for flagging incomplete and possibly duplicate child immunization records.</w:t>
+            </w:r>
+          </w:p>
+        </w:tc>
+      </w:tr>
+      <w:tr>
+        <w:tc>
+          <w:tcPr>
+            <w:tcW w:type="dxa" w:w="2592"/>
+          </w:tcPr>
+          <w:p>
+            <w:r>
+              <w:rPr>
+                <w:b/>
+                <w:sz w:val="18"/>
+              </w:rPr>
+              <w:t>Method, cost, and period</w:t>
+            </w:r>
+          </w:p>
+        </w:tc>
+        <w:tc>
+          <w:tcPr>
+            <w:tcW w:type="dxa" w:w="7632"/>
+          </w:tcPr>
+          <w:p>
+            <w:r>
+              <w:rPr>
+                <w:b w:val="0"/>
+                <w:sz w:val="18"/>
+              </w:rPr>
+              <w:t>Rule-based validation, fuzzy duplicate matching, and a weighted Data Quality Score on de-identified or simulated records. PHP 1,500 to 5,500 over a 12-week plan.</w:t>
+            </w:r>
+          </w:p>
+        </w:tc>
+      </w:tr>
+      <w:tr>
+        <w:tc>
+          <w:tcPr>
+            <w:tcW w:type="dxa" w:w="2592"/>
+          </w:tcPr>
+          <w:p>
+            <w:r>
+              <w:rPr>
+                <w:b/>
+                <w:sz w:val="18"/>
+              </w:rPr>
+              <w:t>Condition for moving to it</w:t>
+            </w:r>
+          </w:p>
+        </w:tc>
+        <w:tc>
+          <w:tcPr>
+            <w:tcW w:type="dxa" w:w="7632"/>
+          </w:tcPr>
+          <w:p>
+            <w:r>
+              <w:rPr>
+                <w:b w:val="0"/>
+                <w:sz w:val="18"/>
+              </w:rPr>
+              <w:t>The group moves to Title 4 only if the titles above it cannot proceed and a health center gives written approval, or the professor accepts simulated records toward the 10,000-record floor.</w:t>
+            </w:r>
+          </w:p>
+        </w:tc>
+      </w:tr>
+    </w:tbl>
+    <w:p>
+      <w:pPr>
+        <w:spacing w:after="40"/>
+      </w:pPr>
+    </w:p>
+    <w:tbl>
+      <w:tblPr>
+        <w:tblStyle w:val="TableGrid"/>
+        <w:tblW w:type="auto" w:w="0"/>
+        <w:jc w:val="center"/>
+        <w:tblLook w:firstColumn="1" w:firstRow="1" w:lastColumn="0" w:lastRow="0" w:noHBand="0" w:noVBand="1" w:val="04A0"/>
+      </w:tblPr>
+      <w:tblGrid>
+        <w:gridCol w:w="5112"/>
+        <w:gridCol w:w="5112"/>
+      </w:tblGrid>
+      <w:tr>
+        <w:tc>
+          <w:tcPr>
+            <w:tcW w:type="dxa" w:w="2592"/>
+            <w:shd w:val="clear" w:color="auto" w:fill="EDEDED"/>
+          </w:tcPr>
+          <w:p>
+            <w:r>
+              <w:rPr>
+                <w:b/>
+                <w:sz w:val="18"/>
+              </w:rPr>
+              <w:t>Rank 6: Fallback Only</w:t>
+            </w:r>
+          </w:p>
+        </w:tc>
+        <w:tc>
+          <w:tcPr>
+            <w:tcW w:type="dxa" w:w="7632"/>
+            <w:shd w:val="clear" w:color="auto" w:fill="EDEDED"/>
+          </w:tcPr>
+          <w:p>
+            <w:r>
+              <w:rPr>
+                <w:b/>
+                <w:sz w:val="18"/>
+              </w:rPr>
+              <w:t>Personal Data Detection and Redaction for National Transmission Corporation Records Using Conditional Random Fields</w:t>
+            </w:r>
+          </w:p>
+        </w:tc>
+      </w:tr>
+      <w:tr>
+        <w:tc>
+          <w:tcPr>
+            <w:tcW w:type="dxa" w:w="2592"/>
+          </w:tcPr>
+          <w:p>
+            <w:r>
+              <w:rPr>
+                <w:b/>
+                <w:sz w:val="18"/>
+              </w:rPr>
+              <w:t>Why it ranks sixth</w:t>
+            </w:r>
+          </w:p>
+        </w:tc>
+        <w:tc>
+          <w:tcPr>
+            <w:tcW w:type="dxa" w:w="7632"/>
+          </w:tcPr>
+          <w:p>
+            <w:r>
+              <w:rPr>
+                <w:b w:val="0"/>
+                <w:sz w:val="18"/>
+              </w:rPr>
+              <w:t>It has the highest feasibility total, because it builds on public and synthetic data and depends on no partner releasing anything. The group keeps it only as a fallback behind the backup title, not as a direction it intends to pursue.</w:t>
+            </w:r>
+          </w:p>
+        </w:tc>
+      </w:tr>
+      <w:tr>
+        <w:tc>
+          <w:tcPr>
+            <w:tcW w:type="dxa" w:w="2592"/>
+          </w:tcPr>
+          <w:p>
+            <w:r>
+              <w:rPr>
+                <w:b/>
+                <w:sz w:val="18"/>
+              </w:rPr>
+              <w:t>What the RRL and RRS establish</w:t>
+            </w:r>
+          </w:p>
+        </w:tc>
+        <w:tc>
+          <w:tcPr>
+            <w:tcW w:type="dxa" w:w="7632"/>
+          </w:tcPr>
+          <w:p>
+            <w:r>
+              <w:rPr>
+                <w:b w:val="0"/>
+                <w:sz w:val="18"/>
+              </w:rPr>
+              <w:t>Meystre et al. (2010) and Stubbs and Uzuner (2015) show that automatic de-identification of free text is an established field. Liu et al. (2015) give the closest template for a Conditional Random Field detector with a rule layer, and Miranda (2023) provides Tagalog language resources. Republic Act No. 10173 and NPC Circular No. 16-03 make a missed identifier a personal data breach.</w:t>
+            </w:r>
+          </w:p>
+        </w:tc>
+      </w:tr>
+      <w:tr>
+        <w:tc>
+          <w:tcPr>
+            <w:tcW w:type="dxa" w:w="2592"/>
+          </w:tcPr>
+          <w:p>
+            <w:r>
+              <w:rPr>
+                <w:b/>
+                <w:sz w:val="18"/>
+              </w:rPr>
+              <w:t>Research gap it fills</w:t>
+            </w:r>
+          </w:p>
+        </w:tc>
+        <w:tc>
+          <w:tcPr>
+            <w:tcW w:type="dxa" w:w="7632"/>
+          </w:tcPr>
+          <w:p>
+            <w:r>
+              <w:rPr>
+                <w:b w:val="0"/>
+                <w:sz w:val="18"/>
+              </w:rPr>
+              <w:t>Published de-identification work targets clinical English text. No study addresses Philippine government documents such as FOI responses and right-of-way records.</w:t>
+            </w:r>
+          </w:p>
+        </w:tc>
+      </w:tr>
+    </w:tbl>
+    <w:p>
+      <w:pPr>
+        <w:spacing w:after="40"/>
+      </w:pPr>
     </w:p>
     <w:p>
       <w:pPr>

</xml_diff>